<commit_message>
Update 2: Fixing up the Phase2.md and Submission pdf's.
</commit_message>
<xml_diff>
--- a/Phase2_Submission.docx
+++ b/Phase2_Submission.docx
@@ -7,13 +7,23 @@
         <w:spacing w:after="106" w:line="259" w:lineRule="auto"/>
         <w:ind w:left="0" w:firstLine="0"/>
       </w:pPr>
+      <w:proofErr w:type="spellStart"/>
       <w:r>
         <w:rPr>
           <w:b/>
           <w:color w:val="8F405F"/>
           <w:sz w:val="36"/>
         </w:rPr>
-        <w:t>Fabuloso - Phase 2 Documentation</w:t>
+        <w:t>Fabuloso</w:t>
+      </w:r>
+      <w:proofErr w:type="spellEnd"/>
+      <w:r>
+        <w:rPr>
+          <w:b/>
+          <w:color w:val="8F405F"/>
+          <w:sz w:val="36"/>
+        </w:rPr>
+        <w:t xml:space="preserve"> - Phase 2 Documentation</w:t>
       </w:r>
     </w:p>
     <w:p>
@@ -73,7 +83,23 @@
         <w:t>Application:</w:t>
       </w:r>
       <w:r>
-        <w:t xml:space="preserve"> Fabuloso</w:t>
+        <w:t xml:space="preserve"> </w:t>
+      </w:r>
+      <w:proofErr w:type="spellStart"/>
+      <w:r>
+        <w:t>Fabuloso</w:t>
+      </w:r>
+      <w:proofErr w:type="spellEnd"/>
+      <w:r>
+        <w:t xml:space="preserve"> / </w:t>
+      </w:r>
+      <w:proofErr w:type="spellStart"/>
+      <w:r>
+        <w:t>Fabulari</w:t>
+      </w:r>
+      <w:proofErr w:type="spellEnd"/>
+      <w:r>
+        <w:tab/>
       </w:r>
     </w:p>
     <w:p>
@@ -90,12 +116,15 @@
       <w:r>
         <w:t xml:space="preserve"> </w:t>
       </w:r>
-      <w:r>
-        <w:rPr>
-          <w:rFonts w:ascii="Courier New" w:eastAsia="Courier New" w:hAnsi="Courier New" w:cs="Courier New"/>
-        </w:rPr>
-        <w:t>https://github.com/R4nd0mHUman/JustChatting</w:t>
-      </w:r>
+      <w:hyperlink r:id="rId7" w:history="1">
+        <w:r>
+          <w:rPr>
+            <w:rStyle w:val="Hyperlink"/>
+            <w:rFonts w:ascii="Courier New" w:eastAsia="Courier New" w:hAnsi="Courier New" w:cs="Courier New"/>
+          </w:rPr>
+          <w:t>https://github.com/R4nd0mHUman/Fabulari</w:t>
+        </w:r>
+      </w:hyperlink>
     </w:p>
     <w:p>
       <w:pPr>
@@ -111,17 +140,32 @@
         <w:spacing w:after="221"/>
         <w:ind w:left="-5"/>
       </w:pPr>
-      <w:r>
-        <w:t xml:space="preserve">Fabuloso is a responsive multi-user group-chat application. Angular provides the browser UI; Node.js/Express provides the REST API; the official </w:t>
-      </w:r>
+      <w:proofErr w:type="spellStart"/>
+      <w:r>
+        <w:t>Fabuloso</w:t>
+      </w:r>
+      <w:proofErr w:type="spellEnd"/>
+      <w:r>
+        <w:t xml:space="preserve"> is a responsive multi-user group-chat application. Angular provides the browser UI; Node.js/Express provides the REST API; the official </w:t>
+      </w:r>
+      <w:proofErr w:type="spellStart"/>
       <w:r>
         <w:rPr>
           <w:rFonts w:ascii="Courier New" w:eastAsia="Courier New" w:hAnsi="Courier New" w:cs="Courier New"/>
         </w:rPr>
         <w:t>mongodb</w:t>
       </w:r>
-      <w:r>
-        <w:t xml:space="preserve"> Node.js driver provides persistent MongoDB access; bcrypt hashes passwords; Multer accepts profile images; and Socket.io provides live channel communication and online/offline presence. Phase 2 does </w:t>
+      <w:proofErr w:type="spellEnd"/>
+      <w:r>
+        <w:t xml:space="preserve"> Node.js driver provides persistent MongoDB access; </w:t>
+      </w:r>
+      <w:proofErr w:type="spellStart"/>
+      <w:r>
+        <w:t>bcrypt</w:t>
+      </w:r>
+      <w:proofErr w:type="spellEnd"/>
+      <w:r>
+        <w:t xml:space="preserve"> hashes passwords; Multer accepts profile images; and Socket.io provides live channel communication and online/offline presence. Phase 2 does </w:t>
       </w:r>
       <w:r>
         <w:rPr>
@@ -145,8 +189,16 @@
         <w:rPr>
           <w:rFonts w:ascii="Courier New" w:eastAsia="Courier New" w:hAnsi="Courier New" w:cs="Courier New"/>
         </w:rPr>
-        <w:t>server/data/mongodb-export.json</w:t>
-      </w:r>
+        <w:t>server/data/</w:t>
+      </w:r>
+      <w:proofErr w:type="spellStart"/>
+      <w:r>
+        <w:rPr>
+          <w:rFonts w:ascii="Courier New" w:eastAsia="Courier New" w:hAnsi="Courier New" w:cs="Courier New"/>
+        </w:rPr>
+        <w:t>mongodb-export.json</w:t>
+      </w:r>
+      <w:proofErr w:type="spellEnd"/>
       <w:r>
         <w:t xml:space="preserve"> is a read-only inspection snapshot and is never loaded as application state.</w:t>
       </w:r>
@@ -169,7 +221,15 @@
         <w:spacing w:line="271" w:lineRule="auto"/>
       </w:pPr>
       <w:r>
-        <w:t>One-time Super Admin bootstrap, normal registration/login/logout, route guards, server-side role checks, private profiles, passwordchange and account deletion.</w:t>
+        <w:t xml:space="preserve">One-time Super Admin bootstrap, normal registration/login/logout, route guards, server-side role checks, private profiles, </w:t>
+      </w:r>
+      <w:proofErr w:type="spellStart"/>
+      <w:r>
+        <w:t>passwordchange</w:t>
+      </w:r>
+      <w:proofErr w:type="spellEnd"/>
+      <w:r>
+        <w:t xml:space="preserve"> and account deletion.</w:t>
       </w:r>
     </w:p>
     <w:p>
@@ -181,7 +241,15 @@
         <w:spacing w:line="271" w:lineRule="auto"/>
       </w:pPr>
       <w:r>
-        <w:t>Group creation requests, Super Admin approval/rejection, group membership requests, age restrictions, group-adminpromotion/demotion, last-admin protection, member removal, group editing and channel CRUD.</w:t>
+        <w:t>Group creation requests, Super Admin approval/rejection, group membership requests, age restrictions, group-</w:t>
+      </w:r>
+      <w:proofErr w:type="spellStart"/>
+      <w:r>
+        <w:t>adminpromotion</w:t>
+      </w:r>
+      <w:proofErr w:type="spellEnd"/>
+      <w:r>
+        <w:t>/demotion, last-admin protection, member removal, group editing and channel CRUD.</w:t>
       </w:r>
     </w:p>
     <w:p>
@@ -193,7 +261,15 @@
         <w:spacing w:line="271" w:lineRule="auto"/>
       </w:pPr>
       <w:r>
-        <w:t>Real-time text and PNG/JPEG/GIF chat, join/leave notices, synchronized own-message deletion, online/offline indicators and fivepersistent message slots per channel. During one open chat session Angular may display more than five live messages; re-entry loads the newest five persisted slots.</w:t>
+        <w:t xml:space="preserve">Real-time text and PNG/JPEG/GIF chat, join/leave notices, synchronized own-message deletion, online/offline indicators and </w:t>
+      </w:r>
+      <w:proofErr w:type="spellStart"/>
+      <w:r>
+        <w:t>fivepersistent</w:t>
+      </w:r>
+      <w:proofErr w:type="spellEnd"/>
+      <w:r>
+        <w:t xml:space="preserve"> message slots per channel. During one open chat session Angular may display more than five live messages; re-entry loads the newest five persisted slots.</w:t>
       </w:r>
     </w:p>
     <w:p>
@@ -217,7 +293,23 @@
         <w:spacing w:line="271" w:lineRule="auto"/>
       </w:pPr>
       <w:r>
-        <w:t>Chat image upload with client and server validation and a 2 MB decoded-image limit. Socket.io's transport buffer is configured above theapplication limit so a valid image close to 2 MB can still be transmitted after Base64 expansion.</w:t>
+        <w:t xml:space="preserve">Chat image upload with client and server validation and a 2 MB decoded-image limit. </w:t>
+      </w:r>
+      <w:proofErr w:type="spellStart"/>
+      <w:r>
+        <w:t>Socket.io's</w:t>
+      </w:r>
+      <w:proofErr w:type="spellEnd"/>
+      <w:r>
+        <w:t xml:space="preserve"> transport buffer is configured above </w:t>
+      </w:r>
+      <w:proofErr w:type="spellStart"/>
+      <w:r>
+        <w:t>theapplication</w:t>
+      </w:r>
+      <w:proofErr w:type="spellEnd"/>
+      <w:r>
+        <w:t xml:space="preserve"> limit so a valid image close to 2 MB can still be transmitted after Base64 expansion.</w:t>
       </w:r>
     </w:p>
     <w:p>
@@ -229,7 +321,15 @@
         <w:spacing w:line="271" w:lineRule="auto"/>
       </w:pPr>
       <w:r>
-        <w:t>Super Admin user/banned-user/audit interfaces and audit filtering.</w:t>
+        <w:t>Super Admin user/</w:t>
+      </w:r>
+      <w:proofErr w:type="gramStart"/>
+      <w:r>
+        <w:t>banned-user</w:t>
+      </w:r>
+      <w:proofErr w:type="gramEnd"/>
+      <w:r>
+        <w:t>/audit interfaces and audit filtering.</w:t>
       </w:r>
     </w:p>
     <w:p>
@@ -241,7 +341,15 @@
         <w:spacing w:after="346" w:line="271" w:lineRule="auto"/>
       </w:pPr>
       <w:r>
-        <w:t>Responsive user and Super Admin visual themes plus supplied Fabulari branding.</w:t>
+        <w:t xml:space="preserve">Responsive user and Super Admin visual themes plus supplied </w:t>
+      </w:r>
+      <w:proofErr w:type="spellStart"/>
+      <w:r>
+        <w:t>Fabulari</w:t>
+      </w:r>
+      <w:proofErr w:type="spellEnd"/>
+      <w:r>
+        <w:t xml:space="preserve"> branding.</w:t>
       </w:r>
     </w:p>
     <w:p>
@@ -279,8 +387,16 @@
         <w:rPr>
           <w:rFonts w:ascii="Courier New" w:hAnsi="Courier New" w:cs="Courier New"/>
         </w:rPr>
-        <w:t xml:space="preserve">  -&gt; Angular standalone components / Router / HttpClient</w:t>
-      </w:r>
+        <w:t xml:space="preserve">  -&gt; Angular standalone components / Router / </w:t>
+      </w:r>
+      <w:proofErr w:type="spellStart"/>
+      <w:r>
+        <w:rPr>
+          <w:rFonts w:ascii="Courier New" w:hAnsi="Courier New" w:cs="Courier New"/>
+        </w:rPr>
+        <w:t>HttpClient</w:t>
+      </w:r>
+      <w:proofErr w:type="spellEnd"/>
     </w:p>
     <w:p>
       <w:pPr>
@@ -307,7 +423,21 @@
         <w:rPr>
           <w:rFonts w:ascii="Courier New" w:hAnsi="Courier New" w:cs="Courier New"/>
         </w:rPr>
-        <w:t xml:space="preserve">  -&gt; native mongodb Node.js driver</w:t>
+        <w:t xml:space="preserve">  -&gt; native </w:t>
+      </w:r>
+      <w:proofErr w:type="spellStart"/>
+      <w:r>
+        <w:rPr>
+          <w:rFonts w:ascii="Courier New" w:hAnsi="Courier New" w:cs="Courier New"/>
+        </w:rPr>
+        <w:t>mongodb</w:t>
+      </w:r>
+      <w:proofErr w:type="spellEnd"/>
+      <w:r>
+        <w:rPr>
+          <w:rFonts w:ascii="Courier New" w:hAnsi="Courier New" w:cs="Courier New"/>
+        </w:rPr>
+        <w:t xml:space="preserve"> Node.js driver</w:t>
       </w:r>
     </w:p>
     <w:p>
@@ -335,7 +465,21 @@
         <w:rPr>
           <w:rFonts w:ascii="Courier New" w:hAnsi="Courier New" w:cs="Courier New"/>
         </w:rPr>
-        <w:t>Browser ChatRoom &lt;-&gt; Socket.io &lt;-&gt; Node server &lt;-&gt; MongoDB messages</w:t>
+        <w:t xml:space="preserve">Browser </w:t>
+      </w:r>
+      <w:proofErr w:type="spellStart"/>
+      <w:r>
+        <w:rPr>
+          <w:rFonts w:ascii="Courier New" w:hAnsi="Courier New" w:cs="Courier New"/>
+        </w:rPr>
+        <w:t>ChatRoom</w:t>
+      </w:r>
+      <w:proofErr w:type="spellEnd"/>
+      <w:r>
+        <w:rPr>
+          <w:rFonts w:ascii="Courier New" w:hAnsi="Courier New" w:cs="Courier New"/>
+        </w:rPr>
+        <w:t xml:space="preserve"> &lt;-&gt; Socket.io &lt;-&gt; Node server &lt;-&gt; MongoDB messages</w:t>
       </w:r>
     </w:p>
     <w:p>
@@ -366,6 +510,731 @@
         <w:t xml:space="preserve">                         -&gt; online-user presence state</w:t>
       </w:r>
     </w:p>
+    <w:tbl>
+      <w:tblPr>
+        <w:tblStyle w:val="TableGrid0"/>
+        <w:tblW w:w="0" w:type="auto"/>
+        <w:tblInd w:w="10" w:type="dxa"/>
+        <w:tblBorders>
+          <w:top w:val="none" w:sz="0" w:space="0" w:color="auto"/>
+          <w:left w:val="none" w:sz="0" w:space="0" w:color="auto"/>
+          <w:bottom w:val="none" w:sz="0" w:space="0" w:color="auto"/>
+          <w:right w:val="none" w:sz="0" w:space="0" w:color="auto"/>
+          <w:insideH w:val="none" w:sz="0" w:space="0" w:color="auto"/>
+          <w:insideV w:val="none" w:sz="0" w:space="0" w:color="auto"/>
+        </w:tblBorders>
+        <w:tblLook w:val="04A0" w:firstRow="1" w:lastRow="0" w:firstColumn="1" w:lastColumn="0" w:noHBand="0" w:noVBand="1"/>
+      </w:tblPr>
+      <w:tblGrid>
+        <w:gridCol w:w="2820"/>
+        <w:gridCol w:w="7306"/>
+      </w:tblGrid>
+      <w:tr>
+        <w:tc>
+          <w:tcPr>
+            <w:tcW w:w="2820" w:type="dxa"/>
+          </w:tcPr>
+          <w:p>
+            <w:pPr>
+              <w:pStyle w:val="NoSpacing"/>
+              <w:ind w:left="0" w:firstLine="0"/>
+              <w:rPr>
+                <w:rFonts w:ascii="Courier New" w:hAnsi="Courier New" w:cs="Courier New"/>
+              </w:rPr>
+            </w:pPr>
+            <w:r>
+              <w:rPr>
+                <w:rFonts w:ascii="Courier New" w:hAnsi="Courier New" w:cs="Courier New"/>
+              </w:rPr>
+              <w:t>Assignment</w:t>
+            </w:r>
+          </w:p>
+        </w:tc>
+        <w:tc>
+          <w:tcPr>
+            <w:tcW w:w="7306" w:type="dxa"/>
+          </w:tcPr>
+          <w:p>
+            <w:pPr>
+              <w:pStyle w:val="NoSpacing"/>
+              <w:ind w:left="0" w:firstLine="0"/>
+              <w:rPr>
+                <w:rFonts w:ascii="Courier New" w:hAnsi="Courier New" w:cs="Courier New"/>
+              </w:rPr>
+            </w:pPr>
+          </w:p>
+        </w:tc>
+      </w:tr>
+      <w:tr>
+        <w:tc>
+          <w:tcPr>
+            <w:tcW w:w="2820" w:type="dxa"/>
+          </w:tcPr>
+          <w:p>
+            <w:pPr>
+              <w:pStyle w:val="NoSpacing"/>
+              <w:ind w:left="0" w:firstLine="0"/>
+              <w:rPr>
+                <w:rFonts w:ascii="Courier New" w:hAnsi="Courier New" w:cs="Courier New"/>
+              </w:rPr>
+            </w:pPr>
+            <w:r>
+              <w:rPr>
+                <w:rFonts w:ascii="Courier New" w:hAnsi="Courier New" w:cs="Courier New"/>
+              </w:rPr>
+              <w:t xml:space="preserve">  </w:t>
+            </w:r>
+            <w:proofErr w:type="spellStart"/>
+            <w:r>
+              <w:rPr>
+                <w:rFonts w:ascii="Courier New" w:hAnsi="Courier New" w:cs="Courier New"/>
+              </w:rPr>
+              <w:t>src</w:t>
+            </w:r>
+            <w:proofErr w:type="spellEnd"/>
+            <w:r>
+              <w:rPr>
+                <w:rFonts w:ascii="Courier New" w:hAnsi="Courier New" w:cs="Courier New"/>
+              </w:rPr>
+              <w:t>/app/</w:t>
+            </w:r>
+          </w:p>
+        </w:tc>
+        <w:tc>
+          <w:tcPr>
+            <w:tcW w:w="7306" w:type="dxa"/>
+          </w:tcPr>
+          <w:p>
+            <w:pPr>
+              <w:pStyle w:val="NoSpacing"/>
+              <w:ind w:left="0" w:firstLine="0"/>
+              <w:rPr>
+                <w:rFonts w:ascii="Courier New" w:hAnsi="Courier New" w:cs="Courier New"/>
+              </w:rPr>
+            </w:pPr>
+            <w:r>
+              <w:rPr>
+                <w:rFonts w:ascii="Courier New" w:hAnsi="Courier New" w:cs="Courier New"/>
+              </w:rPr>
+              <w:t>Angular components, route guards, templates and tests</w:t>
+            </w:r>
+          </w:p>
+        </w:tc>
+      </w:tr>
+      <w:tr>
+        <w:tc>
+          <w:tcPr>
+            <w:tcW w:w="2820" w:type="dxa"/>
+          </w:tcPr>
+          <w:p>
+            <w:pPr>
+              <w:pStyle w:val="NoSpacing"/>
+              <w:rPr>
+                <w:rFonts w:ascii="Courier New" w:hAnsi="Courier New" w:cs="Courier New"/>
+              </w:rPr>
+            </w:pPr>
+            <w:r>
+              <w:rPr>
+                <w:rFonts w:ascii="Courier New" w:hAnsi="Courier New" w:cs="Courier New"/>
+              </w:rPr>
+              <w:t xml:space="preserve">  </w:t>
+            </w:r>
+            <w:r>
+              <w:rPr>
+                <w:rFonts w:ascii="Courier New" w:hAnsi="Courier New" w:cs="Courier New"/>
+              </w:rPr>
+              <w:t>public/assets/Images/</w:t>
+            </w:r>
+          </w:p>
+        </w:tc>
+        <w:tc>
+          <w:tcPr>
+            <w:tcW w:w="7306" w:type="dxa"/>
+          </w:tcPr>
+          <w:p>
+            <w:pPr>
+              <w:pStyle w:val="NoSpacing"/>
+              <w:ind w:left="0" w:firstLine="0"/>
+              <w:rPr>
+                <w:rFonts w:ascii="Courier New" w:hAnsi="Courier New" w:cs="Courier New"/>
+              </w:rPr>
+            </w:pPr>
+            <w:r>
+              <w:rPr>
+                <w:rFonts w:ascii="Courier New" w:hAnsi="Courier New" w:cs="Courier New"/>
+              </w:rPr>
+              <w:t xml:space="preserve">supplied/design imagery including </w:t>
+            </w:r>
+            <w:proofErr w:type="spellStart"/>
+            <w:r>
+              <w:rPr>
+                <w:rFonts w:ascii="Courier New" w:hAnsi="Courier New" w:cs="Courier New"/>
+              </w:rPr>
+              <w:t>Fabulari</w:t>
+            </w:r>
+            <w:proofErr w:type="spellEnd"/>
+            <w:r>
+              <w:rPr>
+                <w:rFonts w:ascii="Courier New" w:hAnsi="Courier New" w:cs="Courier New"/>
+              </w:rPr>
+              <w:t xml:space="preserve"> logo</w:t>
+            </w:r>
+          </w:p>
+        </w:tc>
+      </w:tr>
+      <w:tr>
+        <w:tc>
+          <w:tcPr>
+            <w:tcW w:w="2820" w:type="dxa"/>
+          </w:tcPr>
+          <w:p>
+            <w:pPr>
+              <w:pStyle w:val="NoSpacing"/>
+              <w:rPr>
+                <w:rFonts w:ascii="Courier New" w:hAnsi="Courier New" w:cs="Courier New"/>
+              </w:rPr>
+            </w:pPr>
+            <w:r>
+              <w:rPr>
+                <w:rFonts w:ascii="Courier New" w:hAnsi="Courier New" w:cs="Courier New"/>
+              </w:rPr>
+              <w:t xml:space="preserve">  </w:t>
+            </w:r>
+            <w:r>
+              <w:rPr>
+                <w:rFonts w:ascii="Courier New" w:hAnsi="Courier New" w:cs="Courier New"/>
+              </w:rPr>
+              <w:t>e2e/</w:t>
+            </w:r>
+          </w:p>
+        </w:tc>
+        <w:tc>
+          <w:tcPr>
+            <w:tcW w:w="7306" w:type="dxa"/>
+          </w:tcPr>
+          <w:p>
+            <w:pPr>
+              <w:pStyle w:val="NoSpacing"/>
+              <w:rPr>
+                <w:rFonts w:ascii="Courier New" w:hAnsi="Courier New" w:cs="Courier New"/>
+              </w:rPr>
+            </w:pPr>
+            <w:r>
+              <w:rPr>
+                <w:rFonts w:ascii="Courier New" w:hAnsi="Courier New" w:cs="Courier New"/>
+              </w:rPr>
+              <w:t>Playwright end-to-end tests</w:t>
+            </w:r>
+          </w:p>
+        </w:tc>
+      </w:tr>
+      <w:tr>
+        <w:tc>
+          <w:tcPr>
+            <w:tcW w:w="2820" w:type="dxa"/>
+          </w:tcPr>
+          <w:p>
+            <w:pPr>
+              <w:pStyle w:val="NoSpacing"/>
+              <w:rPr>
+                <w:rFonts w:ascii="Courier New" w:hAnsi="Courier New" w:cs="Courier New"/>
+              </w:rPr>
+            </w:pPr>
+            <w:r>
+              <w:rPr>
+                <w:rFonts w:ascii="Courier New" w:hAnsi="Courier New" w:cs="Courier New"/>
+              </w:rPr>
+              <w:t xml:space="preserve">  </w:t>
+            </w:r>
+            <w:r>
+              <w:rPr>
+                <w:rFonts w:ascii="Courier New" w:hAnsi="Courier New" w:cs="Courier New"/>
+              </w:rPr>
+              <w:t>server/</w:t>
+            </w:r>
+          </w:p>
+        </w:tc>
+        <w:tc>
+          <w:tcPr>
+            <w:tcW w:w="7306" w:type="dxa"/>
+          </w:tcPr>
+          <w:p>
+            <w:pPr>
+              <w:pStyle w:val="NoSpacing"/>
+              <w:ind w:left="0" w:firstLine="0"/>
+              <w:rPr>
+                <w:rFonts w:ascii="Courier New" w:hAnsi="Courier New" w:cs="Courier New"/>
+              </w:rPr>
+            </w:pPr>
+          </w:p>
+        </w:tc>
+      </w:tr>
+      <w:tr>
+        <w:tc>
+          <w:tcPr>
+            <w:tcW w:w="2820" w:type="dxa"/>
+          </w:tcPr>
+          <w:p>
+            <w:pPr>
+              <w:pStyle w:val="NoSpacing"/>
+              <w:rPr>
+                <w:rFonts w:ascii="Courier New" w:hAnsi="Courier New" w:cs="Courier New"/>
+              </w:rPr>
+            </w:pPr>
+            <w:r>
+              <w:rPr>
+                <w:rFonts w:ascii="Courier New" w:hAnsi="Courier New" w:cs="Courier New"/>
+              </w:rPr>
+              <w:t xml:space="preserve">    </w:t>
+            </w:r>
+            <w:r>
+              <w:rPr>
+                <w:rFonts w:ascii="Courier New" w:hAnsi="Courier New" w:cs="Courier New"/>
+              </w:rPr>
+              <w:t>routes/</w:t>
+            </w:r>
+          </w:p>
+        </w:tc>
+        <w:tc>
+          <w:tcPr>
+            <w:tcW w:w="7306" w:type="dxa"/>
+          </w:tcPr>
+          <w:p>
+            <w:pPr>
+              <w:pStyle w:val="NoSpacing"/>
+              <w:rPr>
+                <w:rFonts w:ascii="Courier New" w:hAnsi="Courier New" w:cs="Courier New"/>
+              </w:rPr>
+            </w:pPr>
+            <w:r>
+              <w:rPr>
+                <w:rFonts w:ascii="Courier New" w:hAnsi="Courier New" w:cs="Courier New"/>
+              </w:rPr>
+              <w:t>Express REST route modules</w:t>
+            </w:r>
+          </w:p>
+        </w:tc>
+      </w:tr>
+      <w:tr>
+        <w:tc>
+          <w:tcPr>
+            <w:tcW w:w="2820" w:type="dxa"/>
+          </w:tcPr>
+          <w:p>
+            <w:pPr>
+              <w:pStyle w:val="NoSpacing"/>
+              <w:rPr>
+                <w:rFonts w:ascii="Courier New" w:hAnsi="Courier New" w:cs="Courier New"/>
+              </w:rPr>
+            </w:pPr>
+            <w:r>
+              <w:rPr>
+                <w:rFonts w:ascii="Courier New" w:hAnsi="Courier New" w:cs="Courier New"/>
+              </w:rPr>
+              <w:t xml:space="preserve">    </w:t>
+            </w:r>
+            <w:r>
+              <w:rPr>
+                <w:rFonts w:ascii="Courier New" w:hAnsi="Courier New" w:cs="Courier New"/>
+              </w:rPr>
+              <w:t>middleware/</w:t>
+            </w:r>
+          </w:p>
+        </w:tc>
+        <w:tc>
+          <w:tcPr>
+            <w:tcW w:w="7306" w:type="dxa"/>
+          </w:tcPr>
+          <w:p>
+            <w:pPr>
+              <w:pStyle w:val="NoSpacing"/>
+              <w:rPr>
+                <w:rFonts w:ascii="Courier New" w:hAnsi="Courier New" w:cs="Courier New"/>
+              </w:rPr>
+            </w:pPr>
+            <w:r>
+              <w:rPr>
+                <w:rFonts w:ascii="Courier New" w:hAnsi="Courier New" w:cs="Courier New"/>
+              </w:rPr>
+              <w:t>server authentication/role middleware</w:t>
+            </w:r>
+          </w:p>
+        </w:tc>
+      </w:tr>
+      <w:tr>
+        <w:tc>
+          <w:tcPr>
+            <w:tcW w:w="2820" w:type="dxa"/>
+          </w:tcPr>
+          <w:p>
+            <w:pPr>
+              <w:pStyle w:val="NoSpacing"/>
+              <w:rPr>
+                <w:rFonts w:ascii="Courier New" w:hAnsi="Courier New" w:cs="Courier New"/>
+              </w:rPr>
+            </w:pPr>
+            <w:r>
+              <w:rPr>
+                <w:rFonts w:ascii="Courier New" w:hAnsi="Courier New" w:cs="Courier New"/>
+              </w:rPr>
+              <w:t xml:space="preserve">    tests/</w:t>
+            </w:r>
+          </w:p>
+        </w:tc>
+        <w:tc>
+          <w:tcPr>
+            <w:tcW w:w="7306" w:type="dxa"/>
+          </w:tcPr>
+          <w:p>
+            <w:pPr>
+              <w:pStyle w:val="NoSpacing"/>
+              <w:ind w:left="0" w:firstLine="0"/>
+              <w:rPr>
+                <w:rFonts w:ascii="Courier New" w:hAnsi="Courier New" w:cs="Courier New"/>
+              </w:rPr>
+            </w:pPr>
+            <w:r>
+              <w:rPr>
+                <w:rFonts w:ascii="Courier New" w:hAnsi="Courier New" w:cs="Courier New"/>
+              </w:rPr>
+              <w:t>Node backend unit/validation tests</w:t>
+            </w:r>
+          </w:p>
+        </w:tc>
+      </w:tr>
+      <w:tr>
+        <w:tc>
+          <w:tcPr>
+            <w:tcW w:w="2820" w:type="dxa"/>
+          </w:tcPr>
+          <w:p>
+            <w:pPr>
+              <w:pStyle w:val="NoSpacing"/>
+              <w:rPr>
+                <w:rFonts w:ascii="Courier New" w:hAnsi="Courier New" w:cs="Courier New"/>
+              </w:rPr>
+            </w:pPr>
+            <w:r>
+              <w:rPr>
+                <w:rFonts w:ascii="Courier New" w:hAnsi="Courier New" w:cs="Courier New"/>
+              </w:rPr>
+              <w:t xml:space="preserve">    </w:t>
+            </w:r>
+            <w:r>
+              <w:rPr>
+                <w:rFonts w:ascii="Courier New" w:hAnsi="Courier New" w:cs="Courier New"/>
+              </w:rPr>
+              <w:t>scripts/inspect.js</w:t>
+            </w:r>
+          </w:p>
+        </w:tc>
+        <w:tc>
+          <w:tcPr>
+            <w:tcW w:w="7306" w:type="dxa"/>
+          </w:tcPr>
+          <w:p>
+            <w:pPr>
+              <w:pStyle w:val="NoSpacing"/>
+              <w:ind w:left="0" w:firstLine="0"/>
+              <w:rPr>
+                <w:rFonts w:ascii="Courier New" w:hAnsi="Courier New" w:cs="Courier New"/>
+              </w:rPr>
+            </w:pPr>
+            <w:r>
+              <w:rPr>
+                <w:rFonts w:ascii="Courier New" w:hAnsi="Courier New" w:cs="Courier New"/>
+              </w:rPr>
+              <w:t>direct native-driver MongoDB inspection</w:t>
+            </w:r>
+          </w:p>
+        </w:tc>
+      </w:tr>
+      <w:tr>
+        <w:tc>
+          <w:tcPr>
+            <w:tcW w:w="2820" w:type="dxa"/>
+          </w:tcPr>
+          <w:p>
+            <w:pPr>
+              <w:pStyle w:val="NoSpacing"/>
+              <w:rPr>
+                <w:rFonts w:ascii="Courier New" w:hAnsi="Courier New" w:cs="Courier New"/>
+              </w:rPr>
+            </w:pPr>
+            <w:r>
+              <w:rPr>
+                <w:rFonts w:ascii="Courier New" w:hAnsi="Courier New" w:cs="Courier New"/>
+              </w:rPr>
+              <w:t xml:space="preserve">    </w:t>
+            </w:r>
+            <w:r>
+              <w:rPr>
+                <w:rFonts w:ascii="Courier New" w:hAnsi="Courier New" w:cs="Courier New"/>
+              </w:rPr>
+              <w:t>database.js</w:t>
+            </w:r>
+          </w:p>
+        </w:tc>
+        <w:tc>
+          <w:tcPr>
+            <w:tcW w:w="7306" w:type="dxa"/>
+          </w:tcPr>
+          <w:p>
+            <w:pPr>
+              <w:pStyle w:val="NoSpacing"/>
+              <w:rPr>
+                <w:rFonts w:ascii="Courier New" w:hAnsi="Courier New" w:cs="Courier New"/>
+              </w:rPr>
+            </w:pPr>
+            <w:r>
+              <w:rPr>
+                <w:rFonts w:ascii="Courier New" w:hAnsi="Courier New" w:cs="Courier New"/>
+              </w:rPr>
+              <w:t xml:space="preserve">native </w:t>
+            </w:r>
+            <w:proofErr w:type="spellStart"/>
+            <w:r>
+              <w:rPr>
+                <w:rFonts w:ascii="Courier New" w:hAnsi="Courier New" w:cs="Courier New"/>
+              </w:rPr>
+              <w:t>MongoClient</w:t>
+            </w:r>
+            <w:proofErr w:type="spellEnd"/>
+            <w:r>
+              <w:rPr>
+                <w:rFonts w:ascii="Courier New" w:hAnsi="Courier New" w:cs="Courier New"/>
+              </w:rPr>
+              <w:t xml:space="preserve"> data-access layer</w:t>
+            </w:r>
+          </w:p>
+        </w:tc>
+      </w:tr>
+      <w:tr>
+        <w:tc>
+          <w:tcPr>
+            <w:tcW w:w="2820" w:type="dxa"/>
+          </w:tcPr>
+          <w:p>
+            <w:pPr>
+              <w:pStyle w:val="NoSpacing"/>
+              <w:rPr>
+                <w:rFonts w:ascii="Courier New" w:hAnsi="Courier New" w:cs="Courier New"/>
+              </w:rPr>
+            </w:pPr>
+            <w:r>
+              <w:rPr>
+                <w:rFonts w:ascii="Courier New" w:hAnsi="Courier New" w:cs="Courier New"/>
+              </w:rPr>
+              <w:t xml:space="preserve">    </w:t>
+            </w:r>
+            <w:r>
+              <w:rPr>
+                <w:rFonts w:ascii="Courier New" w:hAnsi="Courier New" w:cs="Courier New"/>
+              </w:rPr>
+              <w:t>server.js</w:t>
+            </w:r>
+          </w:p>
+        </w:tc>
+        <w:tc>
+          <w:tcPr>
+            <w:tcW w:w="7306" w:type="dxa"/>
+          </w:tcPr>
+          <w:p>
+            <w:pPr>
+              <w:pStyle w:val="NoSpacing"/>
+              <w:rPr>
+                <w:rFonts w:ascii="Courier New" w:hAnsi="Courier New" w:cs="Courier New"/>
+              </w:rPr>
+            </w:pPr>
+            <w:r>
+              <w:rPr>
+                <w:rFonts w:ascii="Courier New" w:hAnsi="Courier New" w:cs="Courier New"/>
+              </w:rPr>
+              <w:t>Express + Socket.io entry point</w:t>
+            </w:r>
+          </w:p>
+        </w:tc>
+      </w:tr>
+      <w:tr>
+        <w:tc>
+          <w:tcPr>
+            <w:tcW w:w="2820" w:type="dxa"/>
+          </w:tcPr>
+          <w:p>
+            <w:pPr>
+              <w:pStyle w:val="NoSpacing"/>
+              <w:rPr>
+                <w:rFonts w:ascii="Courier New" w:hAnsi="Courier New" w:cs="Courier New"/>
+              </w:rPr>
+            </w:pPr>
+            <w:r>
+              <w:rPr>
+                <w:rFonts w:ascii="Courier New" w:hAnsi="Courier New" w:cs="Courier New"/>
+              </w:rPr>
+              <w:t xml:space="preserve">    </w:t>
+            </w:r>
+            <w:r>
+              <w:rPr>
+                <w:rFonts w:ascii="Courier New" w:hAnsi="Courier New" w:cs="Courier New"/>
+              </w:rPr>
+              <w:t>export-snapshot.js</w:t>
+            </w:r>
+          </w:p>
+        </w:tc>
+        <w:tc>
+          <w:tcPr>
+            <w:tcW w:w="7306" w:type="dxa"/>
+          </w:tcPr>
+          <w:p>
+            <w:pPr>
+              <w:pStyle w:val="NoSpacing"/>
+              <w:ind w:left="0" w:firstLine="0"/>
+              <w:rPr>
+                <w:rFonts w:ascii="Courier New" w:hAnsi="Courier New" w:cs="Courier New"/>
+              </w:rPr>
+            </w:pPr>
+            <w:r>
+              <w:rPr>
+                <w:rFonts w:ascii="Courier New" w:hAnsi="Courier New" w:cs="Courier New"/>
+              </w:rPr>
+              <w:t>optional JSON inspection export</w:t>
+            </w:r>
+          </w:p>
+        </w:tc>
+      </w:tr>
+      <w:tr>
+        <w:tc>
+          <w:tcPr>
+            <w:tcW w:w="2820" w:type="dxa"/>
+          </w:tcPr>
+          <w:p>
+            <w:pPr>
+              <w:pStyle w:val="NoSpacing"/>
+              <w:rPr>
+                <w:rFonts w:ascii="Courier New" w:hAnsi="Courier New" w:cs="Courier New"/>
+              </w:rPr>
+            </w:pPr>
+            <w:r>
+              <w:rPr>
+                <w:rFonts w:ascii="Courier New" w:hAnsi="Courier New" w:cs="Courier New"/>
+              </w:rPr>
+              <w:t xml:space="preserve">    </w:t>
+            </w:r>
+            <w:r>
+              <w:rPr>
+                <w:rFonts w:ascii="Courier New" w:hAnsi="Courier New" w:cs="Courier New"/>
+              </w:rPr>
+              <w:t>uploads/</w:t>
+            </w:r>
+          </w:p>
+        </w:tc>
+        <w:tc>
+          <w:tcPr>
+            <w:tcW w:w="7306" w:type="dxa"/>
+          </w:tcPr>
+          <w:p>
+            <w:pPr>
+              <w:pStyle w:val="NoSpacing"/>
+              <w:rPr>
+                <w:rFonts w:ascii="Courier New" w:hAnsi="Courier New" w:cs="Courier New"/>
+              </w:rPr>
+            </w:pPr>
+            <w:r>
+              <w:rPr>
+                <w:rFonts w:ascii="Courier New" w:hAnsi="Courier New" w:cs="Courier New"/>
+              </w:rPr>
+              <w:t>uploaded profile-picture files</w:t>
+            </w:r>
+          </w:p>
+        </w:tc>
+      </w:tr>
+      <w:tr>
+        <w:tc>
+          <w:tcPr>
+            <w:tcW w:w="2820" w:type="dxa"/>
+          </w:tcPr>
+          <w:p>
+            <w:pPr>
+              <w:pStyle w:val="NoSpacing"/>
+              <w:rPr>
+                <w:rFonts w:ascii="Courier New" w:hAnsi="Courier New" w:cs="Courier New"/>
+              </w:rPr>
+            </w:pPr>
+            <w:r>
+              <w:rPr>
+                <w:rFonts w:ascii="Courier New" w:hAnsi="Courier New" w:cs="Courier New"/>
+              </w:rPr>
+              <w:t xml:space="preserve">  Phase2.md</w:t>
+            </w:r>
+          </w:p>
+        </w:tc>
+        <w:tc>
+          <w:tcPr>
+            <w:tcW w:w="7306" w:type="dxa"/>
+          </w:tcPr>
+          <w:p>
+            <w:pPr>
+              <w:pStyle w:val="NoSpacing"/>
+              <w:rPr>
+                <w:rFonts w:ascii="Courier New" w:hAnsi="Courier New" w:cs="Courier New"/>
+              </w:rPr>
+            </w:pPr>
+            <w:r>
+              <w:rPr>
+                <w:rFonts w:ascii="Courier New" w:hAnsi="Courier New" w:cs="Courier New"/>
+              </w:rPr>
+              <w:t>this documentation</w:t>
+            </w:r>
+          </w:p>
+        </w:tc>
+      </w:tr>
+      <w:tr>
+        <w:tc>
+          <w:tcPr>
+            <w:tcW w:w="2820" w:type="dxa"/>
+          </w:tcPr>
+          <w:p>
+            <w:pPr>
+              <w:pStyle w:val="NoSpacing"/>
+              <w:rPr>
+                <w:rFonts w:ascii="Courier New" w:hAnsi="Courier New" w:cs="Courier New"/>
+              </w:rPr>
+            </w:pPr>
+            <w:r>
+              <w:rPr>
+                <w:rFonts w:ascii="Courier New" w:hAnsi="Courier New" w:cs="Courier New"/>
+              </w:rPr>
+              <w:t xml:space="preserve">  </w:t>
+            </w:r>
+            <w:r>
+              <w:rPr>
+                <w:rFonts w:ascii="Courier New" w:hAnsi="Courier New" w:cs="Courier New"/>
+              </w:rPr>
+              <w:t>Phase2_Submission.pdf</w:t>
+            </w:r>
+          </w:p>
+        </w:tc>
+        <w:tc>
+          <w:tcPr>
+            <w:tcW w:w="7306" w:type="dxa"/>
+          </w:tcPr>
+          <w:p>
+            <w:pPr>
+              <w:pStyle w:val="NoSpacing"/>
+              <w:rPr>
+                <w:rFonts w:ascii="Courier New" w:hAnsi="Courier New" w:cs="Courier New"/>
+              </w:rPr>
+            </w:pPr>
+            <w:r>
+              <w:rPr>
+                <w:rFonts w:ascii="Courier New" w:hAnsi="Courier New" w:cs="Courier New"/>
+              </w:rPr>
+              <w:t>submission copy of this documentation</w:t>
+            </w:r>
+          </w:p>
+        </w:tc>
+      </w:tr>
+    </w:tbl>
     <w:p>
       <w:pPr>
         <w:pStyle w:val="NoSpacing"/>
@@ -373,26 +1242,15 @@
           <w:rFonts w:ascii="Courier New" w:hAnsi="Courier New" w:cs="Courier New"/>
         </w:rPr>
       </w:pPr>
-      <w:r>
-        <w:rPr>
-          <w:rFonts w:ascii="Courier New" w:hAnsi="Courier New" w:cs="Courier New"/>
-        </w:rPr>
-        <w:t>Assignment/   src/app/                 Angular components, route guards, templates and tests   public/assets/Images/    supplied/design imagery including Fabulari logo   e2e/                     Playwright end-to-end tests   server/     routes/                Express REST route modules     middleware/            server authentication/role middleware     tests/                 Node backend unit/validation tests     scripts/inspect.js     direct native-driver MongoDB inspection     database.js            native MongoClient data-access layer     server.js              Express + Socket.io entry point     export-snapshot.js     optional JSON inspection export     uploads/               uploaded profile-picture files   Phase2.md                this documentation</w:t>
-      </w:r>
     </w:p>
     <w:p>
       <w:pPr>
         <w:pStyle w:val="NoSpacing"/>
+        <w:ind w:left="0" w:firstLine="0"/>
         <w:rPr>
           <w:rFonts w:ascii="Courier New" w:hAnsi="Courier New" w:cs="Courier New"/>
         </w:rPr>
       </w:pPr>
-      <w:r>
-        <w:rPr>
-          <w:rFonts w:ascii="Courier New" w:hAnsi="Courier New" w:cs="Courier New"/>
-        </w:rPr>
-        <w:t xml:space="preserve">  Phase2_Submission.pdf    submission copy of this documentation</w:t>
-      </w:r>
     </w:p>
     <w:p>
       <w:pPr>
@@ -409,7 +1267,15 @@
         <w:ind w:left="-5"/>
       </w:pPr>
       <w:r>
-        <w:t xml:space="preserve">Development should be committed in small logical units rather than one final dump. Appropriate commit subjects include </w:t>
+        <w:t xml:space="preserve">Development should be committed in </w:t>
+      </w:r>
+      <w:proofErr w:type="gramStart"/>
+      <w:r>
+        <w:t>small logical</w:t>
+      </w:r>
+      <w:proofErr w:type="gramEnd"/>
+      <w:r>
+        <w:t xml:space="preserve"> units rather than one final dump. Appropriate commit subjects include </w:t>
       </w:r>
       <w:r>
         <w:rPr>
@@ -427,6 +1293,7 @@
         <w:rPr>
           <w:rFonts w:ascii="Courier New" w:eastAsia="Courier New" w:hAnsi="Courier New" w:cs="Courier New"/>
         </w:rPr>
+        <w:lastRenderedPageBreak/>
         <w:t>group membership approval</w:t>
       </w:r>
       <w:r>
@@ -477,12 +1344,14 @@
       <w:r>
         <w:t>(</w:t>
       </w:r>
+      <w:proofErr w:type="spellStart"/>
       <w:r>
         <w:rPr>
           <w:rFonts w:ascii="Courier New" w:eastAsia="Courier New" w:hAnsi="Courier New" w:cs="Courier New"/>
         </w:rPr>
         <w:t>node_modules</w:t>
       </w:r>
+      <w:proofErr w:type="spellEnd"/>
       <w:r>
         <w:t>) are excluded. The repository root separates Angular, server, tests, assets and documentation so a marker can locate each concern quickly. The tutor must be added as a collaborator if the repository is private.</w:t>
       </w:r>
@@ -493,7 +1362,6 @@
         <w:ind w:left="285" w:hanging="300"/>
       </w:pPr>
       <w:r>
-        <w:lastRenderedPageBreak/>
         <w:t>Persistent data structures</w:t>
       </w:r>
     </w:p>
@@ -678,8 +1546,30 @@
               <w:rPr>
                 <w:szCs w:val="36"/>
               </w:rPr>
-              <w:t>, username, email, DOB/age, bcrypt password, role, groups, profilePicture</w:t>
-            </w:r>
+              <w:t xml:space="preserve">, username, email, DOB/age, </w:t>
+            </w:r>
+            <w:proofErr w:type="spellStart"/>
+            <w:r>
+              <w:rPr>
+                <w:szCs w:val="36"/>
+              </w:rPr>
+              <w:t>bcrypt</w:t>
+            </w:r>
+            <w:proofErr w:type="spellEnd"/>
+            <w:r>
+              <w:rPr>
+                <w:szCs w:val="36"/>
+              </w:rPr>
+              <w:t xml:space="preserve"> password, role, groups, </w:t>
+            </w:r>
+            <w:proofErr w:type="spellStart"/>
+            <w:r>
+              <w:rPr>
+                <w:szCs w:val="36"/>
+              </w:rPr>
+              <w:t>profilePicture</w:t>
+            </w:r>
+            <w:proofErr w:type="spellEnd"/>
           </w:p>
         </w:tc>
         <w:tc>
@@ -769,7 +1659,49 @@
               <w:rPr>
                 <w:szCs w:val="36"/>
               </w:rPr>
-              <w:t>, name, description, ageLimit, theme, members[], admins[]</w:t>
+              <w:t xml:space="preserve">, name, description, </w:t>
+            </w:r>
+            <w:proofErr w:type="spellStart"/>
+            <w:r>
+              <w:rPr>
+                <w:szCs w:val="36"/>
+              </w:rPr>
+              <w:t>ageLimit</w:t>
+            </w:r>
+            <w:proofErr w:type="spellEnd"/>
+            <w:r>
+              <w:rPr>
+                <w:szCs w:val="36"/>
+              </w:rPr>
+              <w:t xml:space="preserve">, theme, </w:t>
+            </w:r>
+            <w:proofErr w:type="gramStart"/>
+            <w:r>
+              <w:rPr>
+                <w:szCs w:val="36"/>
+              </w:rPr>
+              <w:t>members[</w:t>
+            </w:r>
+            <w:proofErr w:type="gramEnd"/>
+            <w:r>
+              <w:rPr>
+                <w:szCs w:val="36"/>
+              </w:rPr>
+              <w:t xml:space="preserve">], </w:t>
+            </w:r>
+            <w:proofErr w:type="gramStart"/>
+            <w:r>
+              <w:rPr>
+                <w:szCs w:val="36"/>
+              </w:rPr>
+              <w:t>admins[</w:t>
+            </w:r>
+            <w:proofErr w:type="gramEnd"/>
+            <w:r>
+              <w:rPr>
+                <w:szCs w:val="36"/>
+              </w:rPr>
+              <w:t>]</w:t>
             </w:r>
           </w:p>
         </w:tc>
@@ -860,7 +1792,21 @@
               <w:rPr>
                 <w:szCs w:val="36"/>
               </w:rPr>
-              <w:t>, groupId, name, description</w:t>
+              <w:t xml:space="preserve">, </w:t>
+            </w:r>
+            <w:proofErr w:type="spellStart"/>
+            <w:r>
+              <w:rPr>
+                <w:szCs w:val="36"/>
+              </w:rPr>
+              <w:t>groupId</w:t>
+            </w:r>
+            <w:proofErr w:type="spellEnd"/>
+            <w:r>
+              <w:rPr>
+                <w:szCs w:val="36"/>
+              </w:rPr>
+              <w:t>, name, description</w:t>
             </w:r>
           </w:p>
         </w:tc>
@@ -1024,11 +1970,47 @@
                 <w:szCs w:val="36"/>
               </w:rPr>
             </w:pPr>
-            <w:r>
-              <w:rPr>
-                <w:szCs w:val="36"/>
-              </w:rPr>
-              <w:t>channelId, userId, username, profilePicture, text, image, deleted, timestamp</w:t>
+            <w:proofErr w:type="spellStart"/>
+            <w:r>
+              <w:rPr>
+                <w:szCs w:val="36"/>
+              </w:rPr>
+              <w:t>channelId</w:t>
+            </w:r>
+            <w:proofErr w:type="spellEnd"/>
+            <w:r>
+              <w:rPr>
+                <w:szCs w:val="36"/>
+              </w:rPr>
+              <w:t xml:space="preserve">, </w:t>
+            </w:r>
+            <w:proofErr w:type="spellStart"/>
+            <w:r>
+              <w:rPr>
+                <w:szCs w:val="36"/>
+              </w:rPr>
+              <w:t>userId</w:t>
+            </w:r>
+            <w:proofErr w:type="spellEnd"/>
+            <w:r>
+              <w:rPr>
+                <w:szCs w:val="36"/>
+              </w:rPr>
+              <w:t xml:space="preserve">, username, </w:t>
+            </w:r>
+            <w:proofErr w:type="spellStart"/>
+            <w:r>
+              <w:rPr>
+                <w:szCs w:val="36"/>
+              </w:rPr>
+              <w:t>profilePicture</w:t>
+            </w:r>
+            <w:proofErr w:type="spellEnd"/>
+            <w:r>
+              <w:rPr>
+                <w:szCs w:val="36"/>
+              </w:rPr>
+              <w:t>, text, image, deleted, timestamp</w:t>
             </w:r>
           </w:p>
         </w:tc>
@@ -1081,6 +2063,7 @@
                 <w:szCs w:val="36"/>
               </w:rPr>
             </w:pPr>
+            <w:proofErr w:type="spellStart"/>
             <w:r>
               <w:rPr>
                 <w:rFonts w:ascii="Courier New" w:eastAsia="Courier New" w:hAnsi="Courier New" w:cs="Courier New"/>
@@ -1088,6 +2071,7 @@
               </w:rPr>
               <w:t>audit_logs</w:t>
             </w:r>
+            <w:proofErr w:type="spellEnd"/>
           </w:p>
         </w:tc>
         <w:tc>
@@ -1165,6 +2149,7 @@
                 <w:szCs w:val="36"/>
               </w:rPr>
             </w:pPr>
+            <w:proofErr w:type="spellStart"/>
             <w:r>
               <w:rPr>
                 <w:rFonts w:ascii="Courier New" w:eastAsia="Courier New" w:hAnsi="Courier New" w:cs="Courier New"/>
@@ -1172,6 +2157,7 @@
               </w:rPr>
               <w:t>banned_emails</w:t>
             </w:r>
+            <w:proofErr w:type="spellEnd"/>
           </w:p>
         </w:tc>
         <w:tc>
@@ -1196,8 +2182,16 @@
               <w:rPr>
                 <w:szCs w:val="36"/>
               </w:rPr>
-              <w:t>email, deletedAt</w:t>
-            </w:r>
+              <w:t xml:space="preserve">email, </w:t>
+            </w:r>
+            <w:proofErr w:type="spellStart"/>
+            <w:r>
+              <w:rPr>
+                <w:szCs w:val="36"/>
+              </w:rPr>
+              <w:t>deletedAt</w:t>
+            </w:r>
+            <w:proofErr w:type="spellEnd"/>
           </w:p>
         </w:tc>
         <w:tc>
@@ -1281,12 +2275,14 @@
       <w:r>
         <w:t xml:space="preserve">; the user's </w:t>
       </w:r>
+      <w:proofErr w:type="spellStart"/>
       <w:r>
         <w:rPr>
           <w:rFonts w:ascii="Courier New" w:eastAsia="Courier New" w:hAnsi="Courier New" w:cs="Courier New"/>
         </w:rPr>
         <w:t>profilePicture</w:t>
       </w:r>
+      <w:proofErr w:type="spellEnd"/>
       <w:r>
         <w:t xml:space="preserve"> field stores the </w:t>
       </w:r>
@@ -1362,57 +2358,69 @@
       <w:r>
         <w:t xml:space="preserve"> handle entry. </w:t>
       </w:r>
+      <w:proofErr w:type="spellStart"/>
       <w:r>
         <w:rPr>
           <w:rFonts w:ascii="Courier New" w:eastAsia="Courier New" w:hAnsi="Courier New" w:cs="Courier New"/>
         </w:rPr>
         <w:t>UserHome</w:t>
       </w:r>
+      <w:proofErr w:type="spellEnd"/>
       <w:r>
         <w:t xml:space="preserve">, </w:t>
       </w:r>
+      <w:proofErr w:type="spellStart"/>
       <w:r>
         <w:rPr>
           <w:rFonts w:ascii="Courier New" w:eastAsia="Courier New" w:hAnsi="Courier New" w:cs="Courier New"/>
         </w:rPr>
         <w:t>GroupSearch</w:t>
       </w:r>
+      <w:proofErr w:type="spellEnd"/>
       <w:r>
         <w:t xml:space="preserve">, </w:t>
       </w:r>
+      <w:proofErr w:type="spellStart"/>
       <w:r>
         <w:rPr>
           <w:rFonts w:ascii="Courier New" w:eastAsia="Courier New" w:hAnsi="Courier New" w:cs="Courier New"/>
         </w:rPr>
         <w:t>CreateGroup</w:t>
       </w:r>
+      <w:proofErr w:type="spellEnd"/>
       <w:r>
         <w:t xml:space="preserve">, </w:t>
       </w:r>
+      <w:proofErr w:type="spellStart"/>
       <w:r>
         <w:rPr>
           <w:rFonts w:ascii="Courier New" w:eastAsia="Courier New" w:hAnsi="Courier New" w:cs="Courier New"/>
         </w:rPr>
         <w:t>GroupRequests</w:t>
       </w:r>
+      <w:proofErr w:type="spellEnd"/>
       <w:r>
         <w:t xml:space="preserve">, </w:t>
       </w:r>
+      <w:proofErr w:type="spellStart"/>
       <w:r>
         <w:rPr>
           <w:rFonts w:ascii="Courier New" w:eastAsia="Courier New" w:hAnsi="Courier New" w:cs="Courier New"/>
         </w:rPr>
         <w:t>MyGroups</w:t>
       </w:r>
+      <w:proofErr w:type="spellEnd"/>
       <w:r>
         <w:t xml:space="preserve">, </w:t>
       </w:r>
+      <w:proofErr w:type="spellStart"/>
       <w:r>
         <w:rPr>
           <w:rFonts w:ascii="Courier New" w:eastAsia="Courier New" w:hAnsi="Courier New" w:cs="Courier New"/>
         </w:rPr>
         <w:t>GroupAdmin</w:t>
       </w:r>
+      <w:proofErr w:type="spellEnd"/>
       <w:r>
         <w:t xml:space="preserve">, </w:t>
       </w:r>
@@ -1425,84 +2433,102 @@
       <w:r>
         <w:t xml:space="preserve"> and </w:t>
       </w:r>
+      <w:proofErr w:type="spellStart"/>
       <w:r>
         <w:rPr>
           <w:rFonts w:ascii="Courier New" w:eastAsia="Courier New" w:hAnsi="Courier New" w:cs="Courier New"/>
         </w:rPr>
         <w:t>ChatRoom</w:t>
       </w:r>
+      <w:proofErr w:type="spellEnd"/>
       <w:r>
         <w:t xml:space="preserve"> implement the user workflow. </w:t>
       </w:r>
+      <w:proofErr w:type="spellStart"/>
       <w:r>
         <w:rPr>
           <w:rFonts w:ascii="Courier New" w:eastAsia="Courier New" w:hAnsi="Courier New" w:cs="Courier New"/>
         </w:rPr>
         <w:t>SuperAdmin</w:t>
       </w:r>
+      <w:proofErr w:type="spellEnd"/>
       <w:r>
         <w:t xml:space="preserve">, </w:t>
       </w:r>
+      <w:proofErr w:type="spellStart"/>
       <w:r>
         <w:rPr>
           <w:rFonts w:ascii="Courier New" w:eastAsia="Courier New" w:hAnsi="Courier New" w:cs="Courier New"/>
         </w:rPr>
         <w:t>UserManagement</w:t>
       </w:r>
+      <w:proofErr w:type="spellEnd"/>
       <w:r>
         <w:t xml:space="preserve">, </w:t>
       </w:r>
+      <w:proofErr w:type="spellStart"/>
       <w:r>
         <w:rPr>
           <w:rFonts w:ascii="Courier New" w:eastAsia="Courier New" w:hAnsi="Courier New" w:cs="Courier New"/>
         </w:rPr>
         <w:t>BannedUsers</w:t>
       </w:r>
+      <w:proofErr w:type="spellEnd"/>
       <w:r>
         <w:t xml:space="preserve">, </w:t>
       </w:r>
+      <w:proofErr w:type="spellStart"/>
       <w:r>
         <w:rPr>
           <w:rFonts w:ascii="Courier New" w:eastAsia="Courier New" w:hAnsi="Courier New" w:cs="Courier New"/>
         </w:rPr>
         <w:t>GroupRequests</w:t>
       </w:r>
+      <w:proofErr w:type="spellEnd"/>
       <w:r>
         <w:t xml:space="preserve"> and </w:t>
       </w:r>
+      <w:proofErr w:type="spellStart"/>
       <w:r>
         <w:rPr>
           <w:rFonts w:ascii="Courier New" w:eastAsia="Courier New" w:hAnsi="Courier New" w:cs="Courier New"/>
         </w:rPr>
         <w:t>AuditLogs</w:t>
       </w:r>
+      <w:proofErr w:type="spellEnd"/>
       <w:r>
         <w:t xml:space="preserve"> implement privileged workflows. </w:t>
       </w:r>
+      <w:proofErr w:type="spellStart"/>
       <w:r>
         <w:rPr>
           <w:rFonts w:ascii="Courier New" w:eastAsia="Courier New" w:hAnsi="Courier New" w:cs="Courier New"/>
         </w:rPr>
         <w:t>authGuard</w:t>
       </w:r>
+      <w:proofErr w:type="spellEnd"/>
       <w:r>
         <w:t xml:space="preserve">, </w:t>
       </w:r>
+      <w:proofErr w:type="spellStart"/>
       <w:r>
         <w:rPr>
           <w:rFonts w:ascii="Courier New" w:eastAsia="Courier New" w:hAnsi="Courier New" w:cs="Courier New"/>
         </w:rPr>
         <w:t>guestGuard</w:t>
       </w:r>
+      <w:proofErr w:type="spellEnd"/>
       <w:r>
         <w:t xml:space="preserve"> and </w:t>
       </w:r>
+      <w:proofErr w:type="spellStart"/>
       <w:r>
         <w:rPr>
           <w:rFonts w:ascii="Courier New" w:eastAsia="Courier New" w:hAnsi="Courier New" w:cs="Courier New"/>
         </w:rPr>
         <w:t>superAdminGuard</w:t>
       </w:r>
+      <w:proofErr w:type="spellEnd"/>
       <w:r>
         <w:t xml:space="preserve"> protect client routes; these are usability controls only, so Express repeats authorization checks server-side.</w:t>
       </w:r>
@@ -1522,12 +2548,14 @@
         <w:spacing w:after="219"/>
         <w:ind w:left="-5"/>
       </w:pPr>
+      <w:proofErr w:type="spellStart"/>
       <w:r>
         <w:rPr>
           <w:rFonts w:ascii="Courier New" w:eastAsia="Courier New" w:hAnsi="Courier New" w:cs="Courier New"/>
         </w:rPr>
         <w:t>HttpClient</w:t>
       </w:r>
+      <w:proofErr w:type="spellEnd"/>
       <w:r>
         <w:t xml:space="preserve"> performs REST communication. </w:t>
       </w:r>
@@ -1540,12 +2568,14 @@
       <w:r>
         <w:t xml:space="preserve"> maintains the live channel connection. Local storage retains the current application user identity for this teaching implementation. </w:t>
       </w:r>
+      <w:proofErr w:type="spellStart"/>
       <w:r>
         <w:rPr>
           <w:rFonts w:ascii="Courier New" w:eastAsia="Courier New" w:hAnsi="Courier New" w:cs="Courier New"/>
         </w:rPr>
         <w:t>ChangeDetectorRef</w:t>
       </w:r>
+      <w:proofErr w:type="spellEnd"/>
       <w:r>
         <w:t xml:space="preserve"> is used where asynchronous HTTP/Socket.io callbacks need an explicit redraw, including administration lists, chat messages and presence updates.</w:t>
       </w:r>
@@ -1555,14 +2585,24 @@
         <w:spacing w:after="218"/>
         <w:ind w:left="-5"/>
       </w:pPr>
+      <w:proofErr w:type="spellStart"/>
       <w:r>
         <w:rPr>
           <w:rFonts w:ascii="Courier New" w:eastAsia="Courier New" w:hAnsi="Courier New" w:cs="Courier New"/>
         </w:rPr>
         <w:t>ChatRoom</w:t>
       </w:r>
-      <w:r>
-        <w:t xml:space="preserve"> separates persistent history from current-session history. It receives the five persisted messages on entry, then appends all new live messages during that visit. It renders each sender's profile picture, current online/offline indicator, timestamp, text/image content and own-message delete control. The chat history scrolls independently so the channel header and composer remain available.</w:t>
+      <w:proofErr w:type="spellEnd"/>
+      <w:r>
+        <w:t xml:space="preserve"> separates persistent history from current-session history. It receives the five persisted messages on entry, then appends all new live messages during that visit. It renders each sender's profile picture, current online/offline indicator, timestamp, text/image content and </w:t>
+      </w:r>
+      <w:proofErr w:type="gramStart"/>
+      <w:r>
+        <w:t>own-message</w:t>
+      </w:r>
+      <w:proofErr w:type="gramEnd"/>
+      <w:r>
+        <w:t xml:space="preserve"> delete control. The chat history scrolls independently so the channel header and composer remain available.</w:t>
       </w:r>
     </w:p>
     <w:p>
@@ -1580,6 +2620,7 @@
         <w:ind w:left="285" w:hanging="300"/>
       </w:pPr>
       <w:r>
+        <w:lastRenderedPageBreak/>
         <w:t>REST API documentation</w:t>
       </w:r>
     </w:p>
@@ -1600,12 +2641,28 @@
       <w:r>
         <w:t xml:space="preserve">. The server re-fetches that user and enforces authority. Error responses use </w:t>
       </w:r>
+      <w:proofErr w:type="gramStart"/>
       <w:r>
         <w:rPr>
           <w:rFonts w:ascii="Courier New" w:eastAsia="Courier New" w:hAnsi="Courier New" w:cs="Courier New"/>
         </w:rPr>
-        <w:t>{ "message": "human readable explanation" }</w:t>
-      </w:r>
+        <w:t>{ "</w:t>
+      </w:r>
+      <w:proofErr w:type="gramEnd"/>
+      <w:r>
+        <w:rPr>
+          <w:rFonts w:ascii="Courier New" w:eastAsia="Courier New" w:hAnsi="Courier New" w:cs="Courier New"/>
+        </w:rPr>
+        <w:t>message": "human readable explanation</w:t>
+      </w:r>
+      <w:proofErr w:type="gramStart"/>
+      <w:r>
+        <w:rPr>
+          <w:rFonts w:ascii="Courier New" w:eastAsia="Courier New" w:hAnsi="Courier New" w:cs="Courier New"/>
+        </w:rPr>
+        <w:t>" }</w:t>
+      </w:r>
+      <w:proofErr w:type="gramEnd"/>
       <w:r>
         <w:t xml:space="preserve"> with appropriate HTTP status codes.</w:t>
       </w:r>
@@ -1617,7 +2674,6 @@
         <w:ind w:left="-5"/>
       </w:pPr>
       <w:r>
-        <w:lastRenderedPageBreak/>
         <w:t>Authentication</w:t>
       </w:r>
     </w:p>
@@ -1769,7 +2825,23 @@
                 <w:rFonts w:ascii="Courier New" w:eastAsia="Courier New" w:hAnsi="Courier New" w:cs="Courier New"/>
                 <w:szCs w:val="36"/>
               </w:rPr>
-              <w:t>GET /api/auth/bootstrap-status</w:t>
+              <w:t>GET /</w:t>
+            </w:r>
+            <w:proofErr w:type="spellStart"/>
+            <w:r>
+              <w:rPr>
+                <w:rFonts w:ascii="Courier New" w:eastAsia="Courier New" w:hAnsi="Courier New" w:cs="Courier New"/>
+                <w:szCs w:val="36"/>
+              </w:rPr>
+              <w:t>api</w:t>
+            </w:r>
+            <w:proofErr w:type="spellEnd"/>
+            <w:r>
+              <w:rPr>
+                <w:rFonts w:ascii="Courier New" w:eastAsia="Courier New" w:hAnsi="Courier New" w:cs="Courier New"/>
+                <w:szCs w:val="36"/>
+              </w:rPr>
+              <w:t>/auth/bootstrap-status</w:t>
             </w:r>
           </w:p>
         </w:tc>
@@ -1822,7 +2894,23 @@
                 <w:rFonts w:ascii="Courier New" w:eastAsia="Courier New" w:hAnsi="Courier New" w:cs="Courier New"/>
                 <w:szCs w:val="36"/>
               </w:rPr>
-              <w:t>{bootstrapRequired}</w:t>
+              <w:t>{</w:t>
+            </w:r>
+            <w:proofErr w:type="spellStart"/>
+            <w:r>
+              <w:rPr>
+                <w:rFonts w:ascii="Courier New" w:eastAsia="Courier New" w:hAnsi="Courier New" w:cs="Courier New"/>
+                <w:szCs w:val="36"/>
+              </w:rPr>
+              <w:t>bootstrapRequired</w:t>
+            </w:r>
+            <w:proofErr w:type="spellEnd"/>
+            <w:r>
+              <w:rPr>
+                <w:rFonts w:ascii="Courier New" w:eastAsia="Courier New" w:hAnsi="Courier New" w:cs="Courier New"/>
+                <w:szCs w:val="36"/>
+              </w:rPr>
+              <w:t>}</w:t>
             </w:r>
             <w:r>
               <w:rPr>
@@ -1875,7 +2963,23 @@
                 <w:rFonts w:ascii="Courier New" w:eastAsia="Courier New" w:hAnsi="Courier New" w:cs="Courier New"/>
                 <w:szCs w:val="36"/>
               </w:rPr>
-              <w:t>POST /api/auth/bootstrap</w:t>
+              <w:t>POST /</w:t>
+            </w:r>
+            <w:proofErr w:type="spellStart"/>
+            <w:r>
+              <w:rPr>
+                <w:rFonts w:ascii="Courier New" w:eastAsia="Courier New" w:hAnsi="Courier New" w:cs="Courier New"/>
+                <w:szCs w:val="36"/>
+              </w:rPr>
+              <w:t>api</w:t>
+            </w:r>
+            <w:proofErr w:type="spellEnd"/>
+            <w:r>
+              <w:rPr>
+                <w:rFonts w:ascii="Courier New" w:eastAsia="Courier New" w:hAnsi="Courier New" w:cs="Courier New"/>
+                <w:szCs w:val="36"/>
+              </w:rPr>
+              <w:t>/auth/bootstrap</w:t>
             </w:r>
           </w:p>
         </w:tc>
@@ -1927,7 +3031,21 @@
               <w:rPr>
                 <w:szCs w:val="36"/>
               </w:rPr>
-              <w:t>201; creates the single bcrypt-hashed Super Admin</w:t>
+              <w:t xml:space="preserve">201; creates the single </w:t>
+            </w:r>
+            <w:proofErr w:type="spellStart"/>
+            <w:r>
+              <w:rPr>
+                <w:szCs w:val="36"/>
+              </w:rPr>
+              <w:t>bcrypt</w:t>
+            </w:r>
+            <w:proofErr w:type="spellEnd"/>
+            <w:r>
+              <w:rPr>
+                <w:szCs w:val="36"/>
+              </w:rPr>
+              <w:t>-hashed Super Admin</w:t>
             </w:r>
           </w:p>
         </w:tc>
@@ -1959,7 +3077,23 @@
                 <w:rFonts w:ascii="Courier New" w:eastAsia="Courier New" w:hAnsi="Courier New" w:cs="Courier New"/>
                 <w:szCs w:val="36"/>
               </w:rPr>
-              <w:t>POST /api/auth/register</w:t>
+              <w:t>POST /</w:t>
+            </w:r>
+            <w:proofErr w:type="spellStart"/>
+            <w:r>
+              <w:rPr>
+                <w:rFonts w:ascii="Courier New" w:eastAsia="Courier New" w:hAnsi="Courier New" w:cs="Courier New"/>
+                <w:szCs w:val="36"/>
+              </w:rPr>
+              <w:t>api</w:t>
+            </w:r>
+            <w:proofErr w:type="spellEnd"/>
+            <w:r>
+              <w:rPr>
+                <w:rFonts w:ascii="Courier New" w:eastAsia="Courier New" w:hAnsi="Courier New" w:cs="Courier New"/>
+                <w:szCs w:val="36"/>
+              </w:rPr>
+              <w:t>/auth/register</w:t>
             </w:r>
           </w:p>
         </w:tc>
@@ -2018,7 +3152,25 @@
                 <w:rFonts w:ascii="Courier New" w:eastAsia="Courier New" w:hAnsi="Courier New" w:cs="Courier New"/>
                 <w:szCs w:val="36"/>
               </w:rPr>
-              <w:t>{message,user}</w:t>
+              <w:t>{</w:t>
+            </w:r>
+            <w:proofErr w:type="spellStart"/>
+            <w:proofErr w:type="gramStart"/>
+            <w:r>
+              <w:rPr>
+                <w:rFonts w:ascii="Courier New" w:eastAsia="Courier New" w:hAnsi="Courier New" w:cs="Courier New"/>
+                <w:szCs w:val="36"/>
+              </w:rPr>
+              <w:t>message,user</w:t>
+            </w:r>
+            <w:proofErr w:type="spellEnd"/>
+            <w:proofErr w:type="gramEnd"/>
+            <w:r>
+              <w:rPr>
+                <w:rFonts w:ascii="Courier New" w:eastAsia="Courier New" w:hAnsi="Courier New" w:cs="Courier New"/>
+                <w:szCs w:val="36"/>
+              </w:rPr>
+              <w:t>}</w:t>
             </w:r>
             <w:r>
               <w:rPr>
@@ -2056,7 +3208,23 @@
                 <w:rFonts w:ascii="Courier New" w:eastAsia="Courier New" w:hAnsi="Courier New" w:cs="Courier New"/>
                 <w:szCs w:val="36"/>
               </w:rPr>
-              <w:t>POST /api/auth/login</w:t>
+              <w:t>POST /</w:t>
+            </w:r>
+            <w:proofErr w:type="spellStart"/>
+            <w:r>
+              <w:rPr>
+                <w:rFonts w:ascii="Courier New" w:eastAsia="Courier New" w:hAnsi="Courier New" w:cs="Courier New"/>
+                <w:szCs w:val="36"/>
+              </w:rPr>
+              <w:t>api</w:t>
+            </w:r>
+            <w:proofErr w:type="spellEnd"/>
+            <w:r>
+              <w:rPr>
+                <w:rFonts w:ascii="Courier New" w:eastAsia="Courier New" w:hAnsi="Courier New" w:cs="Courier New"/>
+                <w:szCs w:val="36"/>
+              </w:rPr>
+              <w:t>/auth/login</w:t>
             </w:r>
           </w:p>
         </w:tc>
@@ -2108,7 +3276,21 @@
               <w:rPr>
                 <w:szCs w:val="36"/>
               </w:rPr>
-              <w:t>safe user object; bcrypt verification</w:t>
+              <w:t xml:space="preserve">safe user object; </w:t>
+            </w:r>
+            <w:proofErr w:type="spellStart"/>
+            <w:r>
+              <w:rPr>
+                <w:szCs w:val="36"/>
+              </w:rPr>
+              <w:t>bcrypt</w:t>
+            </w:r>
+            <w:proofErr w:type="spellEnd"/>
+            <w:r>
+              <w:rPr>
+                <w:szCs w:val="36"/>
+              </w:rPr>
+              <w:t xml:space="preserve"> verification</w:t>
             </w:r>
           </w:p>
         </w:tc>
@@ -2140,7 +3322,23 @@
                 <w:rFonts w:ascii="Courier New" w:eastAsia="Courier New" w:hAnsi="Courier New" w:cs="Courier New"/>
                 <w:szCs w:val="36"/>
               </w:rPr>
-              <w:t>GET /api/auth/me</w:t>
+              <w:t>GET /</w:t>
+            </w:r>
+            <w:proofErr w:type="spellStart"/>
+            <w:r>
+              <w:rPr>
+                <w:rFonts w:ascii="Courier New" w:eastAsia="Courier New" w:hAnsi="Courier New" w:cs="Courier New"/>
+                <w:szCs w:val="36"/>
+              </w:rPr>
+              <w:t>api</w:t>
+            </w:r>
+            <w:proofErr w:type="spellEnd"/>
+            <w:r>
+              <w:rPr>
+                <w:rFonts w:ascii="Courier New" w:eastAsia="Courier New" w:hAnsi="Courier New" w:cs="Courier New"/>
+                <w:szCs w:val="36"/>
+              </w:rPr>
+              <w:t>/auth/me</w:t>
             </w:r>
           </w:p>
         </w:tc>
@@ -2224,7 +3422,23 @@
                 <w:rFonts w:ascii="Courier New" w:eastAsia="Courier New" w:hAnsi="Courier New" w:cs="Courier New"/>
                 <w:szCs w:val="36"/>
               </w:rPr>
-              <w:t>DELETE /api/auth/me</w:t>
+              <w:t>DELETE /</w:t>
+            </w:r>
+            <w:proofErr w:type="spellStart"/>
+            <w:r>
+              <w:rPr>
+                <w:rFonts w:ascii="Courier New" w:eastAsia="Courier New" w:hAnsi="Courier New" w:cs="Courier New"/>
+                <w:szCs w:val="36"/>
+              </w:rPr>
+              <w:t>api</w:t>
+            </w:r>
+            <w:proofErr w:type="spellEnd"/>
+            <w:r>
+              <w:rPr>
+                <w:rFonts w:ascii="Courier New" w:eastAsia="Courier New" w:hAnsi="Courier New" w:cs="Courier New"/>
+                <w:szCs w:val="36"/>
+              </w:rPr>
+              <w:t>/auth/me</w:t>
             </w:r>
           </w:p>
         </w:tc>
@@ -2308,7 +3522,23 @@
                 <w:rFonts w:ascii="Courier New" w:eastAsia="Courier New" w:hAnsi="Courier New" w:cs="Courier New"/>
                 <w:szCs w:val="36"/>
               </w:rPr>
-              <w:t>POST /api/auth/logout</w:t>
+              <w:t>POST /</w:t>
+            </w:r>
+            <w:proofErr w:type="spellStart"/>
+            <w:r>
+              <w:rPr>
+                <w:rFonts w:ascii="Courier New" w:eastAsia="Courier New" w:hAnsi="Courier New" w:cs="Courier New"/>
+                <w:szCs w:val="36"/>
+              </w:rPr>
+              <w:t>api</w:t>
+            </w:r>
+            <w:proofErr w:type="spellEnd"/>
+            <w:r>
+              <w:rPr>
+                <w:rFonts w:ascii="Courier New" w:eastAsia="Courier New" w:hAnsi="Courier New" w:cs="Courier New"/>
+                <w:szCs w:val="36"/>
+              </w:rPr>
+              <w:t>/auth/logout</w:t>
             </w:r>
           </w:p>
         </w:tc>
@@ -2524,7 +3754,23 @@
                 <w:rFonts w:ascii="Courier New" w:eastAsia="Courier New" w:hAnsi="Courier New" w:cs="Courier New"/>
                 <w:szCs w:val="36"/>
               </w:rPr>
-              <w:t>GET /api/groups</w:t>
+              <w:t>GET /</w:t>
+            </w:r>
+            <w:proofErr w:type="spellStart"/>
+            <w:r>
+              <w:rPr>
+                <w:rFonts w:ascii="Courier New" w:eastAsia="Courier New" w:hAnsi="Courier New" w:cs="Courier New"/>
+                <w:szCs w:val="36"/>
+              </w:rPr>
+              <w:t>api</w:t>
+            </w:r>
+            <w:proofErr w:type="spellEnd"/>
+            <w:r>
+              <w:rPr>
+                <w:rFonts w:ascii="Courier New" w:eastAsia="Courier New" w:hAnsi="Courier New" w:cs="Courier New"/>
+                <w:szCs w:val="36"/>
+              </w:rPr>
+              <w:t>/groups</w:t>
             </w:r>
           </w:p>
         </w:tc>
@@ -2608,7 +3854,23 @@
                 <w:rFonts w:ascii="Courier New" w:eastAsia="Courier New" w:hAnsi="Courier New" w:cs="Courier New"/>
                 <w:szCs w:val="36"/>
               </w:rPr>
-              <w:t>GET /api/groups/:id</w:t>
+              <w:t>GET /</w:t>
+            </w:r>
+            <w:proofErr w:type="spellStart"/>
+            <w:r>
+              <w:rPr>
+                <w:rFonts w:ascii="Courier New" w:eastAsia="Courier New" w:hAnsi="Courier New" w:cs="Courier New"/>
+                <w:szCs w:val="36"/>
+              </w:rPr>
+              <w:t>api</w:t>
+            </w:r>
+            <w:proofErr w:type="spellEnd"/>
+            <w:r>
+              <w:rPr>
+                <w:rFonts w:ascii="Courier New" w:eastAsia="Courier New" w:hAnsi="Courier New" w:cs="Courier New"/>
+                <w:szCs w:val="36"/>
+              </w:rPr>
+              <w:t>/groups/:id</w:t>
             </w:r>
           </w:p>
         </w:tc>
@@ -2692,7 +3954,23 @@
                 <w:rFonts w:ascii="Courier New" w:eastAsia="Courier New" w:hAnsi="Courier New" w:cs="Courier New"/>
                 <w:szCs w:val="36"/>
               </w:rPr>
-              <w:t>POST /api/groups/requests</w:t>
+              <w:t>POST /</w:t>
+            </w:r>
+            <w:proofErr w:type="spellStart"/>
+            <w:r>
+              <w:rPr>
+                <w:rFonts w:ascii="Courier New" w:eastAsia="Courier New" w:hAnsi="Courier New" w:cs="Courier New"/>
+                <w:szCs w:val="36"/>
+              </w:rPr>
+              <w:t>api</w:t>
+            </w:r>
+            <w:proofErr w:type="spellEnd"/>
+            <w:r>
+              <w:rPr>
+                <w:rFonts w:ascii="Courier New" w:eastAsia="Courier New" w:hAnsi="Courier New" w:cs="Courier New"/>
+                <w:szCs w:val="36"/>
+              </w:rPr>
+              <w:t>/groups/requests</w:t>
             </w:r>
           </w:p>
         </w:tc>
@@ -2718,8 +3996,16 @@
               <w:rPr>
                 <w:szCs w:val="36"/>
               </w:rPr>
-              <w:t>name, description, ageLimit</w:t>
-            </w:r>
+              <w:t xml:space="preserve">name, description, </w:t>
+            </w:r>
+            <w:proofErr w:type="spellStart"/>
+            <w:r>
+              <w:rPr>
+                <w:szCs w:val="36"/>
+              </w:rPr>
+              <w:t>ageLimit</w:t>
+            </w:r>
+            <w:proofErr w:type="spellEnd"/>
           </w:p>
         </w:tc>
         <w:tc>
@@ -2776,7 +4062,23 @@
                 <w:rFonts w:ascii="Courier New" w:eastAsia="Courier New" w:hAnsi="Courier New" w:cs="Courier New"/>
                 <w:szCs w:val="36"/>
               </w:rPr>
-              <w:t>GET /api/groups/requests/user/:id</w:t>
+              <w:t>GET /</w:t>
+            </w:r>
+            <w:proofErr w:type="spellStart"/>
+            <w:r>
+              <w:rPr>
+                <w:rFonts w:ascii="Courier New" w:eastAsia="Courier New" w:hAnsi="Courier New" w:cs="Courier New"/>
+                <w:szCs w:val="36"/>
+              </w:rPr>
+              <w:t>api</w:t>
+            </w:r>
+            <w:proofErr w:type="spellEnd"/>
+            <w:r>
+              <w:rPr>
+                <w:rFonts w:ascii="Courier New" w:eastAsia="Courier New" w:hAnsi="Courier New" w:cs="Courier New"/>
+                <w:szCs w:val="36"/>
+              </w:rPr>
+              <w:t>/groups/requests/user/:id</w:t>
             </w:r>
           </w:p>
         </w:tc>
@@ -2860,7 +4162,23 @@
                 <w:rFonts w:ascii="Courier New" w:eastAsia="Courier New" w:hAnsi="Courier New" w:cs="Courier New"/>
                 <w:szCs w:val="36"/>
               </w:rPr>
-              <w:t>GET /api/groups/membership-requests/user/:id</w:t>
+              <w:t>GET /</w:t>
+            </w:r>
+            <w:proofErr w:type="spellStart"/>
+            <w:r>
+              <w:rPr>
+                <w:rFonts w:ascii="Courier New" w:eastAsia="Courier New" w:hAnsi="Courier New" w:cs="Courier New"/>
+                <w:szCs w:val="36"/>
+              </w:rPr>
+              <w:t>api</w:t>
+            </w:r>
+            <w:proofErr w:type="spellEnd"/>
+            <w:r>
+              <w:rPr>
+                <w:rFonts w:ascii="Courier New" w:eastAsia="Courier New" w:hAnsi="Courier New" w:cs="Courier New"/>
+                <w:szCs w:val="36"/>
+              </w:rPr>
+              <w:t>/groups/membership-requests/user/:id</w:t>
             </w:r>
           </w:p>
         </w:tc>
@@ -2944,7 +4262,23 @@
                 <w:rFonts w:ascii="Courier New" w:eastAsia="Courier New" w:hAnsi="Courier New" w:cs="Courier New"/>
                 <w:szCs w:val="36"/>
               </w:rPr>
-              <w:t>GET /api/groups/requests/creation</w:t>
+              <w:t>GET /</w:t>
+            </w:r>
+            <w:proofErr w:type="spellStart"/>
+            <w:r>
+              <w:rPr>
+                <w:rFonts w:ascii="Courier New" w:eastAsia="Courier New" w:hAnsi="Courier New" w:cs="Courier New"/>
+                <w:szCs w:val="36"/>
+              </w:rPr>
+              <w:t>api</w:t>
+            </w:r>
+            <w:proofErr w:type="spellEnd"/>
+            <w:r>
+              <w:rPr>
+                <w:rFonts w:ascii="Courier New" w:eastAsia="Courier New" w:hAnsi="Courier New" w:cs="Courier New"/>
+                <w:szCs w:val="36"/>
+              </w:rPr>
+              <w:t>/groups/requests/creation</w:t>
             </w:r>
           </w:p>
         </w:tc>
@@ -3132,7 +4466,23 @@
                 <w:rFonts w:ascii="Courier New" w:eastAsia="Courier New" w:hAnsi="Courier New" w:cs="Courier New"/>
                 <w:szCs w:val="36"/>
               </w:rPr>
-              <w:t>POST /api/groups/requests/:id/approve</w:t>
+              <w:t>POST /</w:t>
+            </w:r>
+            <w:proofErr w:type="spellStart"/>
+            <w:r>
+              <w:rPr>
+                <w:rFonts w:ascii="Courier New" w:eastAsia="Courier New" w:hAnsi="Courier New" w:cs="Courier New"/>
+                <w:szCs w:val="36"/>
+              </w:rPr>
+              <w:t>api</w:t>
+            </w:r>
+            <w:proofErr w:type="spellEnd"/>
+            <w:r>
+              <w:rPr>
+                <w:rFonts w:ascii="Courier New" w:eastAsia="Courier New" w:hAnsi="Courier New" w:cs="Courier New"/>
+                <w:szCs w:val="36"/>
+              </w:rPr>
+              <w:t>/groups/requests/:id/approve</w:t>
             </w:r>
           </w:p>
         </w:tc>
@@ -3216,7 +4566,23 @@
                 <w:rFonts w:ascii="Courier New" w:eastAsia="Courier New" w:hAnsi="Courier New" w:cs="Courier New"/>
                 <w:szCs w:val="36"/>
               </w:rPr>
-              <w:t>POST /api/groups/requests/:id/reject</w:t>
+              <w:t>POST /</w:t>
+            </w:r>
+            <w:proofErr w:type="spellStart"/>
+            <w:r>
+              <w:rPr>
+                <w:rFonts w:ascii="Courier New" w:eastAsia="Courier New" w:hAnsi="Courier New" w:cs="Courier New"/>
+                <w:szCs w:val="36"/>
+              </w:rPr>
+              <w:t>api</w:t>
+            </w:r>
+            <w:proofErr w:type="spellEnd"/>
+            <w:r>
+              <w:rPr>
+                <w:rFonts w:ascii="Courier New" w:eastAsia="Courier New" w:hAnsi="Courier New" w:cs="Courier New"/>
+                <w:szCs w:val="36"/>
+              </w:rPr>
+              <w:t>/groups/requests/:id/reject</w:t>
             </w:r>
           </w:p>
         </w:tc>
@@ -3300,7 +4666,23 @@
                 <w:rFonts w:ascii="Courier New" w:eastAsia="Courier New" w:hAnsi="Courier New" w:cs="Courier New"/>
                 <w:szCs w:val="36"/>
               </w:rPr>
-              <w:t>POST /api/groups/:id/join-request</w:t>
+              <w:t>POST /</w:t>
+            </w:r>
+            <w:proofErr w:type="spellStart"/>
+            <w:r>
+              <w:rPr>
+                <w:rFonts w:ascii="Courier New" w:eastAsia="Courier New" w:hAnsi="Courier New" w:cs="Courier New"/>
+                <w:szCs w:val="36"/>
+              </w:rPr>
+              <w:t>api</w:t>
+            </w:r>
+            <w:proofErr w:type="spellEnd"/>
+            <w:r>
+              <w:rPr>
+                <w:rFonts w:ascii="Courier New" w:eastAsia="Courier New" w:hAnsi="Courier New" w:cs="Courier New"/>
+                <w:szCs w:val="36"/>
+              </w:rPr>
+              <w:t>/groups/:id/join-request</w:t>
             </w:r>
           </w:p>
         </w:tc>
@@ -3384,7 +4766,23 @@
                 <w:rFonts w:ascii="Courier New" w:eastAsia="Courier New" w:hAnsi="Courier New" w:cs="Courier New"/>
                 <w:szCs w:val="36"/>
               </w:rPr>
-              <w:t>GET /api/groups/requests/admin/:id</w:t>
+              <w:t>GET /</w:t>
+            </w:r>
+            <w:proofErr w:type="spellStart"/>
+            <w:r>
+              <w:rPr>
+                <w:rFonts w:ascii="Courier New" w:eastAsia="Courier New" w:hAnsi="Courier New" w:cs="Courier New"/>
+                <w:szCs w:val="36"/>
+              </w:rPr>
+              <w:t>api</w:t>
+            </w:r>
+            <w:proofErr w:type="spellEnd"/>
+            <w:r>
+              <w:rPr>
+                <w:rFonts w:ascii="Courier New" w:eastAsia="Courier New" w:hAnsi="Courier New" w:cs="Courier New"/>
+                <w:szCs w:val="36"/>
+              </w:rPr>
+              <w:t>/groups/requests/admin/:id</w:t>
             </w:r>
           </w:p>
         </w:tc>
@@ -3468,7 +4866,55 @@
                 <w:rFonts w:ascii="Courier New" w:eastAsia="Courier New" w:hAnsi="Courier New" w:cs="Courier New"/>
                 <w:szCs w:val="36"/>
               </w:rPr>
-              <w:t>POST /api/groups/:gid/membership-requests/:r id/approve</w:t>
+              <w:t>POST /</w:t>
+            </w:r>
+            <w:proofErr w:type="spellStart"/>
+            <w:r>
+              <w:rPr>
+                <w:rFonts w:ascii="Courier New" w:eastAsia="Courier New" w:hAnsi="Courier New" w:cs="Courier New"/>
+                <w:szCs w:val="36"/>
+              </w:rPr>
+              <w:t>api</w:t>
+            </w:r>
+            <w:proofErr w:type="spellEnd"/>
+            <w:r>
+              <w:rPr>
+                <w:rFonts w:ascii="Courier New" w:eastAsia="Courier New" w:hAnsi="Courier New" w:cs="Courier New"/>
+                <w:szCs w:val="36"/>
+              </w:rPr>
+              <w:t>/groups</w:t>
+            </w:r>
+            <w:proofErr w:type="gramStart"/>
+            <w:r>
+              <w:rPr>
+                <w:rFonts w:ascii="Courier New" w:eastAsia="Courier New" w:hAnsi="Courier New" w:cs="Courier New"/>
+                <w:szCs w:val="36"/>
+              </w:rPr>
+              <w:t>/:gid</w:t>
+            </w:r>
+            <w:proofErr w:type="gramEnd"/>
+            <w:r>
+              <w:rPr>
+                <w:rFonts w:ascii="Courier New" w:eastAsia="Courier New" w:hAnsi="Courier New" w:cs="Courier New"/>
+                <w:szCs w:val="36"/>
+              </w:rPr>
+              <w:t>/membership-requests</w:t>
+            </w:r>
+            <w:proofErr w:type="gramStart"/>
+            <w:r>
+              <w:rPr>
+                <w:rFonts w:ascii="Courier New" w:eastAsia="Courier New" w:hAnsi="Courier New" w:cs="Courier New"/>
+                <w:szCs w:val="36"/>
+              </w:rPr>
+              <w:t>/:r</w:t>
+            </w:r>
+            <w:proofErr w:type="gramEnd"/>
+            <w:r>
+              <w:rPr>
+                <w:rFonts w:ascii="Courier New" w:eastAsia="Courier New" w:hAnsi="Courier New" w:cs="Courier New"/>
+                <w:szCs w:val="36"/>
+              </w:rPr>
+              <w:t xml:space="preserve"> id/approve</w:t>
             </w:r>
           </w:p>
         </w:tc>
@@ -3552,7 +4998,55 @@
                 <w:rFonts w:ascii="Courier New" w:eastAsia="Courier New" w:hAnsi="Courier New" w:cs="Courier New"/>
                 <w:szCs w:val="36"/>
               </w:rPr>
-              <w:t>POST /api/groups/:gid/membership-requests/:r id/reject</w:t>
+              <w:t>POST /</w:t>
+            </w:r>
+            <w:proofErr w:type="spellStart"/>
+            <w:r>
+              <w:rPr>
+                <w:rFonts w:ascii="Courier New" w:eastAsia="Courier New" w:hAnsi="Courier New" w:cs="Courier New"/>
+                <w:szCs w:val="36"/>
+              </w:rPr>
+              <w:t>api</w:t>
+            </w:r>
+            <w:proofErr w:type="spellEnd"/>
+            <w:r>
+              <w:rPr>
+                <w:rFonts w:ascii="Courier New" w:eastAsia="Courier New" w:hAnsi="Courier New" w:cs="Courier New"/>
+                <w:szCs w:val="36"/>
+              </w:rPr>
+              <w:t>/groups</w:t>
+            </w:r>
+            <w:proofErr w:type="gramStart"/>
+            <w:r>
+              <w:rPr>
+                <w:rFonts w:ascii="Courier New" w:eastAsia="Courier New" w:hAnsi="Courier New" w:cs="Courier New"/>
+                <w:szCs w:val="36"/>
+              </w:rPr>
+              <w:t>/:gid</w:t>
+            </w:r>
+            <w:proofErr w:type="gramEnd"/>
+            <w:r>
+              <w:rPr>
+                <w:rFonts w:ascii="Courier New" w:eastAsia="Courier New" w:hAnsi="Courier New" w:cs="Courier New"/>
+                <w:szCs w:val="36"/>
+              </w:rPr>
+              <w:t>/membership-requests</w:t>
+            </w:r>
+            <w:proofErr w:type="gramStart"/>
+            <w:r>
+              <w:rPr>
+                <w:rFonts w:ascii="Courier New" w:eastAsia="Courier New" w:hAnsi="Courier New" w:cs="Courier New"/>
+                <w:szCs w:val="36"/>
+              </w:rPr>
+              <w:t>/:r</w:t>
+            </w:r>
+            <w:proofErr w:type="gramEnd"/>
+            <w:r>
+              <w:rPr>
+                <w:rFonts w:ascii="Courier New" w:eastAsia="Courier New" w:hAnsi="Courier New" w:cs="Courier New"/>
+                <w:szCs w:val="36"/>
+              </w:rPr>
+              <w:t xml:space="preserve"> id/reject</w:t>
             </w:r>
           </w:p>
         </w:tc>
@@ -3636,7 +5130,23 @@
                 <w:rFonts w:ascii="Courier New" w:eastAsia="Courier New" w:hAnsi="Courier New" w:cs="Courier New"/>
                 <w:szCs w:val="36"/>
               </w:rPr>
-              <w:t>GET /api/groups/user/:id</w:t>
+              <w:t>GET /</w:t>
+            </w:r>
+            <w:proofErr w:type="spellStart"/>
+            <w:r>
+              <w:rPr>
+                <w:rFonts w:ascii="Courier New" w:eastAsia="Courier New" w:hAnsi="Courier New" w:cs="Courier New"/>
+                <w:szCs w:val="36"/>
+              </w:rPr>
+              <w:t>api</w:t>
+            </w:r>
+            <w:proofErr w:type="spellEnd"/>
+            <w:r>
+              <w:rPr>
+                <w:rFonts w:ascii="Courier New" w:eastAsia="Courier New" w:hAnsi="Courier New" w:cs="Courier New"/>
+                <w:szCs w:val="36"/>
+              </w:rPr>
+              <w:t>/groups/user/:id</w:t>
             </w:r>
           </w:p>
         </w:tc>
@@ -3720,7 +5230,23 @@
                 <w:rFonts w:ascii="Courier New" w:eastAsia="Courier New" w:hAnsi="Courier New" w:cs="Courier New"/>
                 <w:szCs w:val="36"/>
               </w:rPr>
-              <w:t>GET /api/groups/owned/:id</w:t>
+              <w:t>GET /</w:t>
+            </w:r>
+            <w:proofErr w:type="spellStart"/>
+            <w:r>
+              <w:rPr>
+                <w:rFonts w:ascii="Courier New" w:eastAsia="Courier New" w:hAnsi="Courier New" w:cs="Courier New"/>
+                <w:szCs w:val="36"/>
+              </w:rPr>
+              <w:t>api</w:t>
+            </w:r>
+            <w:proofErr w:type="spellEnd"/>
+            <w:r>
+              <w:rPr>
+                <w:rFonts w:ascii="Courier New" w:eastAsia="Courier New" w:hAnsi="Courier New" w:cs="Courier New"/>
+                <w:szCs w:val="36"/>
+              </w:rPr>
+              <w:t>/groups/owned/:id</w:t>
             </w:r>
           </w:p>
         </w:tc>
@@ -3804,7 +5330,23 @@
                 <w:rFonts w:ascii="Courier New" w:eastAsia="Courier New" w:hAnsi="Courier New" w:cs="Courier New"/>
                 <w:szCs w:val="36"/>
               </w:rPr>
-              <w:t>GET /api/groups/:id/members</w:t>
+              <w:t>GET /</w:t>
+            </w:r>
+            <w:proofErr w:type="spellStart"/>
+            <w:r>
+              <w:rPr>
+                <w:rFonts w:ascii="Courier New" w:eastAsia="Courier New" w:hAnsi="Courier New" w:cs="Courier New"/>
+                <w:szCs w:val="36"/>
+              </w:rPr>
+              <w:t>api</w:t>
+            </w:r>
+            <w:proofErr w:type="spellEnd"/>
+            <w:r>
+              <w:rPr>
+                <w:rFonts w:ascii="Courier New" w:eastAsia="Courier New" w:hAnsi="Courier New" w:cs="Courier New"/>
+                <w:szCs w:val="36"/>
+              </w:rPr>
+              <w:t>/groups/:id/members</w:t>
             </w:r>
           </w:p>
         </w:tc>
@@ -3888,7 +5430,23 @@
                 <w:rFonts w:ascii="Courier New" w:eastAsia="Courier New" w:hAnsi="Courier New" w:cs="Courier New"/>
                 <w:szCs w:val="36"/>
               </w:rPr>
-              <w:t>PUT /api/groups/:id</w:t>
+              <w:t>PUT /</w:t>
+            </w:r>
+            <w:proofErr w:type="spellStart"/>
+            <w:r>
+              <w:rPr>
+                <w:rFonts w:ascii="Courier New" w:eastAsia="Courier New" w:hAnsi="Courier New" w:cs="Courier New"/>
+                <w:szCs w:val="36"/>
+              </w:rPr>
+              <w:t>api</w:t>
+            </w:r>
+            <w:proofErr w:type="spellEnd"/>
+            <w:r>
+              <w:rPr>
+                <w:rFonts w:ascii="Courier New" w:eastAsia="Courier New" w:hAnsi="Courier New" w:cs="Courier New"/>
+                <w:szCs w:val="36"/>
+              </w:rPr>
+              <w:t>/groups/:id</w:t>
             </w:r>
           </w:p>
         </w:tc>
@@ -3914,7 +5472,21 @@
               <w:rPr>
                 <w:szCs w:val="36"/>
               </w:rPr>
-              <w:t>name/description/ageLimit/theme</w:t>
+              <w:t>name/description/</w:t>
+            </w:r>
+            <w:proofErr w:type="spellStart"/>
+            <w:r>
+              <w:rPr>
+                <w:szCs w:val="36"/>
+              </w:rPr>
+              <w:t>ageLimit</w:t>
+            </w:r>
+            <w:proofErr w:type="spellEnd"/>
+            <w:r>
+              <w:rPr>
+                <w:szCs w:val="36"/>
+              </w:rPr>
+              <w:t>/theme</w:t>
             </w:r>
           </w:p>
         </w:tc>
@@ -3972,7 +5544,48 @@
                 <w:rFonts w:ascii="Courier New" w:eastAsia="Courier New" w:hAnsi="Courier New" w:cs="Courier New"/>
                 <w:szCs w:val="36"/>
               </w:rPr>
-              <w:t>POST /api/groups/:id/admins/:uid/promote</w:t>
+              <w:t>POST /</w:t>
+            </w:r>
+            <w:proofErr w:type="spellStart"/>
+            <w:r>
+              <w:rPr>
+                <w:rFonts w:ascii="Courier New" w:eastAsia="Courier New" w:hAnsi="Courier New" w:cs="Courier New"/>
+                <w:szCs w:val="36"/>
+              </w:rPr>
+              <w:t>api</w:t>
+            </w:r>
+            <w:proofErr w:type="spellEnd"/>
+            <w:r>
+              <w:rPr>
+                <w:rFonts w:ascii="Courier New" w:eastAsia="Courier New" w:hAnsi="Courier New" w:cs="Courier New"/>
+                <w:szCs w:val="36"/>
+              </w:rPr>
+              <w:t>/groups/:id/admins</w:t>
+            </w:r>
+            <w:proofErr w:type="gramStart"/>
+            <w:r>
+              <w:rPr>
+                <w:rFonts w:ascii="Courier New" w:eastAsia="Courier New" w:hAnsi="Courier New" w:cs="Courier New"/>
+                <w:szCs w:val="36"/>
+              </w:rPr>
+              <w:t>/:</w:t>
+            </w:r>
+            <w:proofErr w:type="spellStart"/>
+            <w:r>
+              <w:rPr>
+                <w:rFonts w:ascii="Courier New" w:eastAsia="Courier New" w:hAnsi="Courier New" w:cs="Courier New"/>
+                <w:szCs w:val="36"/>
+              </w:rPr>
+              <w:t>uid</w:t>
+            </w:r>
+            <w:proofErr w:type="spellEnd"/>
+            <w:proofErr w:type="gramEnd"/>
+            <w:r>
+              <w:rPr>
+                <w:rFonts w:ascii="Courier New" w:eastAsia="Courier New" w:hAnsi="Courier New" w:cs="Courier New"/>
+                <w:szCs w:val="36"/>
+              </w:rPr>
+              <w:t>/promote</w:t>
             </w:r>
           </w:p>
         </w:tc>
@@ -4056,7 +5669,49 @@
                 <w:rFonts w:ascii="Courier New" w:eastAsia="Courier New" w:hAnsi="Courier New" w:cs="Courier New"/>
                 <w:szCs w:val="36"/>
               </w:rPr>
-              <w:t>POST /api/groups/:id/admins/:uid/demote</w:t>
+              <w:lastRenderedPageBreak/>
+              <w:t>POST /</w:t>
+            </w:r>
+            <w:proofErr w:type="spellStart"/>
+            <w:r>
+              <w:rPr>
+                <w:rFonts w:ascii="Courier New" w:eastAsia="Courier New" w:hAnsi="Courier New" w:cs="Courier New"/>
+                <w:szCs w:val="36"/>
+              </w:rPr>
+              <w:t>api</w:t>
+            </w:r>
+            <w:proofErr w:type="spellEnd"/>
+            <w:r>
+              <w:rPr>
+                <w:rFonts w:ascii="Courier New" w:eastAsia="Courier New" w:hAnsi="Courier New" w:cs="Courier New"/>
+                <w:szCs w:val="36"/>
+              </w:rPr>
+              <w:t>/groups/:id/admins</w:t>
+            </w:r>
+            <w:proofErr w:type="gramStart"/>
+            <w:r>
+              <w:rPr>
+                <w:rFonts w:ascii="Courier New" w:eastAsia="Courier New" w:hAnsi="Courier New" w:cs="Courier New"/>
+                <w:szCs w:val="36"/>
+              </w:rPr>
+              <w:t>/:</w:t>
+            </w:r>
+            <w:proofErr w:type="spellStart"/>
+            <w:r>
+              <w:rPr>
+                <w:rFonts w:ascii="Courier New" w:eastAsia="Courier New" w:hAnsi="Courier New" w:cs="Courier New"/>
+                <w:szCs w:val="36"/>
+              </w:rPr>
+              <w:t>uid</w:t>
+            </w:r>
+            <w:proofErr w:type="spellEnd"/>
+            <w:proofErr w:type="gramEnd"/>
+            <w:r>
+              <w:rPr>
+                <w:rFonts w:ascii="Courier New" w:eastAsia="Courier New" w:hAnsi="Courier New" w:cs="Courier New"/>
+                <w:szCs w:val="36"/>
+              </w:rPr>
+              <w:t>/demote</w:t>
             </w:r>
           </w:p>
         </w:tc>
@@ -4140,8 +5795,42 @@
                 <w:rFonts w:ascii="Courier New" w:eastAsia="Courier New" w:hAnsi="Courier New" w:cs="Courier New"/>
                 <w:szCs w:val="36"/>
               </w:rPr>
-              <w:t>DELETE /api/groups/:id/members/:uid</w:t>
-            </w:r>
+              <w:t>DELETE /</w:t>
+            </w:r>
+            <w:proofErr w:type="spellStart"/>
+            <w:r>
+              <w:rPr>
+                <w:rFonts w:ascii="Courier New" w:eastAsia="Courier New" w:hAnsi="Courier New" w:cs="Courier New"/>
+                <w:szCs w:val="36"/>
+              </w:rPr>
+              <w:t>api</w:t>
+            </w:r>
+            <w:proofErr w:type="spellEnd"/>
+            <w:r>
+              <w:rPr>
+                <w:rFonts w:ascii="Courier New" w:eastAsia="Courier New" w:hAnsi="Courier New" w:cs="Courier New"/>
+                <w:szCs w:val="36"/>
+              </w:rPr>
+              <w:t>/groups/:id/members</w:t>
+            </w:r>
+            <w:proofErr w:type="gramStart"/>
+            <w:r>
+              <w:rPr>
+                <w:rFonts w:ascii="Courier New" w:eastAsia="Courier New" w:hAnsi="Courier New" w:cs="Courier New"/>
+                <w:szCs w:val="36"/>
+              </w:rPr>
+              <w:t>/:</w:t>
+            </w:r>
+            <w:proofErr w:type="spellStart"/>
+            <w:r>
+              <w:rPr>
+                <w:rFonts w:ascii="Courier New" w:eastAsia="Courier New" w:hAnsi="Courier New" w:cs="Courier New"/>
+                <w:szCs w:val="36"/>
+              </w:rPr>
+              <w:t>uid</w:t>
+            </w:r>
+            <w:proofErr w:type="spellEnd"/>
+            <w:proofErr w:type="gramEnd"/>
           </w:p>
         </w:tc>
         <w:tc>
@@ -4206,7 +5895,6 @@
         <w:ind w:left="-5"/>
       </w:pPr>
       <w:r>
-        <w:lastRenderedPageBreak/>
         <w:t>Channels, profiles and Super Admin</w:t>
       </w:r>
     </w:p>
@@ -4358,7 +6046,23 @@
                 <w:rFonts w:ascii="Courier New" w:eastAsia="Courier New" w:hAnsi="Courier New" w:cs="Courier New"/>
                 <w:szCs w:val="36"/>
               </w:rPr>
-              <w:t>POST /api/groups/channels</w:t>
+              <w:t>POST /</w:t>
+            </w:r>
+            <w:proofErr w:type="spellStart"/>
+            <w:r>
+              <w:rPr>
+                <w:rFonts w:ascii="Courier New" w:eastAsia="Courier New" w:hAnsi="Courier New" w:cs="Courier New"/>
+                <w:szCs w:val="36"/>
+              </w:rPr>
+              <w:t>api</w:t>
+            </w:r>
+            <w:proofErr w:type="spellEnd"/>
+            <w:r>
+              <w:rPr>
+                <w:rFonts w:ascii="Courier New" w:eastAsia="Courier New" w:hAnsi="Courier New" w:cs="Courier New"/>
+                <w:szCs w:val="36"/>
+              </w:rPr>
+              <w:t>/groups/channels</w:t>
             </w:r>
           </w:p>
         </w:tc>
@@ -4380,11 +6084,19 @@
                 <w:szCs w:val="36"/>
               </w:rPr>
             </w:pPr>
-            <w:r>
-              <w:rPr>
-                <w:szCs w:val="36"/>
-              </w:rPr>
-              <w:t>groupId, name, description</w:t>
+            <w:proofErr w:type="spellStart"/>
+            <w:r>
+              <w:rPr>
+                <w:szCs w:val="36"/>
+              </w:rPr>
+              <w:t>groupId</w:t>
+            </w:r>
+            <w:proofErr w:type="spellEnd"/>
+            <w:r>
+              <w:rPr>
+                <w:szCs w:val="36"/>
+              </w:rPr>
+              <w:t>, name, description</w:t>
             </w:r>
           </w:p>
         </w:tc>
@@ -4442,7 +6154,23 @@
                 <w:rFonts w:ascii="Courier New" w:eastAsia="Courier New" w:hAnsi="Courier New" w:cs="Courier New"/>
                 <w:szCs w:val="36"/>
               </w:rPr>
-              <w:t>GET /api/groups/:id/rooms</w:t>
+              <w:t>GET /</w:t>
+            </w:r>
+            <w:proofErr w:type="spellStart"/>
+            <w:r>
+              <w:rPr>
+                <w:rFonts w:ascii="Courier New" w:eastAsia="Courier New" w:hAnsi="Courier New" w:cs="Courier New"/>
+                <w:szCs w:val="36"/>
+              </w:rPr>
+              <w:t>api</w:t>
+            </w:r>
+            <w:proofErr w:type="spellEnd"/>
+            <w:r>
+              <w:rPr>
+                <w:rFonts w:ascii="Courier New" w:eastAsia="Courier New" w:hAnsi="Courier New" w:cs="Courier New"/>
+                <w:szCs w:val="36"/>
+              </w:rPr>
+              <w:t>/groups/:id/rooms</w:t>
             </w:r>
           </w:p>
         </w:tc>
@@ -4526,7 +6254,23 @@
                 <w:rFonts w:ascii="Courier New" w:eastAsia="Courier New" w:hAnsi="Courier New" w:cs="Courier New"/>
                 <w:szCs w:val="36"/>
               </w:rPr>
-              <w:t>GET /api/groups/channels/group/:id</w:t>
+              <w:t>GET /</w:t>
+            </w:r>
+            <w:proofErr w:type="spellStart"/>
+            <w:r>
+              <w:rPr>
+                <w:rFonts w:ascii="Courier New" w:eastAsia="Courier New" w:hAnsi="Courier New" w:cs="Courier New"/>
+                <w:szCs w:val="36"/>
+              </w:rPr>
+              <w:t>api</w:t>
+            </w:r>
+            <w:proofErr w:type="spellEnd"/>
+            <w:r>
+              <w:rPr>
+                <w:rFonts w:ascii="Courier New" w:eastAsia="Courier New" w:hAnsi="Courier New" w:cs="Courier New"/>
+                <w:szCs w:val="36"/>
+              </w:rPr>
+              <w:t>/groups/channels/group/:id</w:t>
             </w:r>
           </w:p>
         </w:tc>
@@ -4610,7 +6354,23 @@
                 <w:rFonts w:ascii="Courier New" w:eastAsia="Courier New" w:hAnsi="Courier New" w:cs="Courier New"/>
                 <w:szCs w:val="36"/>
               </w:rPr>
-              <w:t>PUT /api/groups/channels/:id</w:t>
+              <w:t>PUT /</w:t>
+            </w:r>
+            <w:proofErr w:type="spellStart"/>
+            <w:r>
+              <w:rPr>
+                <w:rFonts w:ascii="Courier New" w:eastAsia="Courier New" w:hAnsi="Courier New" w:cs="Courier New"/>
+                <w:szCs w:val="36"/>
+              </w:rPr>
+              <w:t>api</w:t>
+            </w:r>
+            <w:proofErr w:type="spellEnd"/>
+            <w:r>
+              <w:rPr>
+                <w:rFonts w:ascii="Courier New" w:eastAsia="Courier New" w:hAnsi="Courier New" w:cs="Courier New"/>
+                <w:szCs w:val="36"/>
+              </w:rPr>
+              <w:t>/groups/channels/:id</w:t>
             </w:r>
           </w:p>
         </w:tc>
@@ -4694,7 +6454,23 @@
                 <w:rFonts w:ascii="Courier New" w:eastAsia="Courier New" w:hAnsi="Courier New" w:cs="Courier New"/>
                 <w:szCs w:val="36"/>
               </w:rPr>
-              <w:t>DELETE /api/groups/channels/:id</w:t>
+              <w:t>DELETE /</w:t>
+            </w:r>
+            <w:proofErr w:type="spellStart"/>
+            <w:r>
+              <w:rPr>
+                <w:rFonts w:ascii="Courier New" w:eastAsia="Courier New" w:hAnsi="Courier New" w:cs="Courier New"/>
+                <w:szCs w:val="36"/>
+              </w:rPr>
+              <w:t>api</w:t>
+            </w:r>
+            <w:proofErr w:type="spellEnd"/>
+            <w:r>
+              <w:rPr>
+                <w:rFonts w:ascii="Courier New" w:eastAsia="Courier New" w:hAnsi="Courier New" w:cs="Courier New"/>
+                <w:szCs w:val="36"/>
+              </w:rPr>
+              <w:t>/groups/channels/:id</w:t>
             </w:r>
           </w:p>
         </w:tc>
@@ -4778,7 +6554,23 @@
                 <w:rFonts w:ascii="Courier New" w:eastAsia="Courier New" w:hAnsi="Courier New" w:cs="Courier New"/>
                 <w:szCs w:val="36"/>
               </w:rPr>
-              <w:t>GET /api/profile/:id</w:t>
+              <w:t>GET /</w:t>
+            </w:r>
+            <w:proofErr w:type="spellStart"/>
+            <w:r>
+              <w:rPr>
+                <w:rFonts w:ascii="Courier New" w:eastAsia="Courier New" w:hAnsi="Courier New" w:cs="Courier New"/>
+                <w:szCs w:val="36"/>
+              </w:rPr>
+              <w:t>api</w:t>
+            </w:r>
+            <w:proofErr w:type="spellEnd"/>
+            <w:r>
+              <w:rPr>
+                <w:rFonts w:ascii="Courier New" w:eastAsia="Courier New" w:hAnsi="Courier New" w:cs="Courier New"/>
+                <w:szCs w:val="36"/>
+              </w:rPr>
+              <w:t>/profile/:id</w:t>
             </w:r>
           </w:p>
         </w:tc>
@@ -4862,7 +6654,23 @@
                 <w:rFonts w:ascii="Courier New" w:eastAsia="Courier New" w:hAnsi="Courier New" w:cs="Courier New"/>
                 <w:szCs w:val="36"/>
               </w:rPr>
-              <w:t>PUT /api/profile/:id</w:t>
+              <w:t>PUT /</w:t>
+            </w:r>
+            <w:proofErr w:type="spellStart"/>
+            <w:r>
+              <w:rPr>
+                <w:rFonts w:ascii="Courier New" w:eastAsia="Courier New" w:hAnsi="Courier New" w:cs="Courier New"/>
+                <w:szCs w:val="36"/>
+              </w:rPr>
+              <w:t>api</w:t>
+            </w:r>
+            <w:proofErr w:type="spellEnd"/>
+            <w:r>
+              <w:rPr>
+                <w:rFonts w:ascii="Courier New" w:eastAsia="Courier New" w:hAnsi="Courier New" w:cs="Courier New"/>
+                <w:szCs w:val="36"/>
+              </w:rPr>
+              <w:t>/profile/:id</w:t>
             </w:r>
           </w:p>
         </w:tc>
@@ -4946,7 +6754,23 @@
                 <w:rFonts w:ascii="Courier New" w:eastAsia="Courier New" w:hAnsi="Courier New" w:cs="Courier New"/>
                 <w:szCs w:val="36"/>
               </w:rPr>
-              <w:t>PUT /api/profile/:id/password</w:t>
+              <w:t>PUT /</w:t>
+            </w:r>
+            <w:proofErr w:type="spellStart"/>
+            <w:r>
+              <w:rPr>
+                <w:rFonts w:ascii="Courier New" w:eastAsia="Courier New" w:hAnsi="Courier New" w:cs="Courier New"/>
+                <w:szCs w:val="36"/>
+              </w:rPr>
+              <w:t>api</w:t>
+            </w:r>
+            <w:proofErr w:type="spellEnd"/>
+            <w:r>
+              <w:rPr>
+                <w:rFonts w:ascii="Courier New" w:eastAsia="Courier New" w:hAnsi="Courier New" w:cs="Courier New"/>
+                <w:szCs w:val="36"/>
+              </w:rPr>
+              <w:t>/profile/:id/password</w:t>
             </w:r>
           </w:p>
         </w:tc>
@@ -4968,12 +6792,28 @@
                 <w:szCs w:val="36"/>
               </w:rPr>
             </w:pPr>
-            <w:r>
-              <w:rPr>
-                <w:szCs w:val="36"/>
-              </w:rPr>
-              <w:t>currentPassword/newPassword</w:t>
-            </w:r>
+            <w:proofErr w:type="spellStart"/>
+            <w:r>
+              <w:rPr>
+                <w:szCs w:val="36"/>
+              </w:rPr>
+              <w:t>currentPassword</w:t>
+            </w:r>
+            <w:proofErr w:type="spellEnd"/>
+            <w:r>
+              <w:rPr>
+                <w:szCs w:val="36"/>
+              </w:rPr>
+              <w:t>/</w:t>
+            </w:r>
+            <w:proofErr w:type="spellStart"/>
+            <w:r>
+              <w:rPr>
+                <w:szCs w:val="36"/>
+              </w:rPr>
+              <w:t>newPassword</w:t>
+            </w:r>
+            <w:proofErr w:type="spellEnd"/>
           </w:p>
         </w:tc>
         <w:tc>
@@ -5030,7 +6870,23 @@
                 <w:rFonts w:ascii="Courier New" w:eastAsia="Courier New" w:hAnsi="Courier New" w:cs="Courier New"/>
                 <w:szCs w:val="36"/>
               </w:rPr>
-              <w:t>PUT /api/profile/:id/picture</w:t>
+              <w:t>PUT /</w:t>
+            </w:r>
+            <w:proofErr w:type="spellStart"/>
+            <w:r>
+              <w:rPr>
+                <w:rFonts w:ascii="Courier New" w:eastAsia="Courier New" w:hAnsi="Courier New" w:cs="Courier New"/>
+                <w:szCs w:val="36"/>
+              </w:rPr>
+              <w:t>api</w:t>
+            </w:r>
+            <w:proofErr w:type="spellEnd"/>
+            <w:r>
+              <w:rPr>
+                <w:rFonts w:ascii="Courier New" w:eastAsia="Courier New" w:hAnsi="Courier New" w:cs="Courier New"/>
+                <w:szCs w:val="36"/>
+              </w:rPr>
+              <w:t>/profile/:id/picture</w:t>
             </w:r>
           </w:p>
         </w:tc>
@@ -5058,6 +6914,7 @@
               </w:rPr>
               <w:t xml:space="preserve">multipart </w:t>
             </w:r>
+            <w:proofErr w:type="spellStart"/>
             <w:r>
               <w:rPr>
                 <w:rFonts w:ascii="Courier New" w:eastAsia="Courier New" w:hAnsi="Courier New" w:cs="Courier New"/>
@@ -5065,6 +6922,7 @@
               </w:rPr>
               <w:t>profilePicture</w:t>
             </w:r>
+            <w:proofErr w:type="spellEnd"/>
           </w:p>
         </w:tc>
         <w:tc>
@@ -5134,7 +6992,23 @@
                 <w:rFonts w:ascii="Courier New" w:eastAsia="Courier New" w:hAnsi="Courier New" w:cs="Courier New"/>
                 <w:szCs w:val="36"/>
               </w:rPr>
-              <w:t>GET /api/admin/users</w:t>
+              <w:t>GET /</w:t>
+            </w:r>
+            <w:proofErr w:type="spellStart"/>
+            <w:r>
+              <w:rPr>
+                <w:rFonts w:ascii="Courier New" w:eastAsia="Courier New" w:hAnsi="Courier New" w:cs="Courier New"/>
+                <w:szCs w:val="36"/>
+              </w:rPr>
+              <w:t>api</w:t>
+            </w:r>
+            <w:proofErr w:type="spellEnd"/>
+            <w:r>
+              <w:rPr>
+                <w:rFonts w:ascii="Courier New" w:eastAsia="Courier New" w:hAnsi="Courier New" w:cs="Courier New"/>
+                <w:szCs w:val="36"/>
+              </w:rPr>
+              <w:t>/admin/users</w:t>
             </w:r>
           </w:p>
         </w:tc>
@@ -5218,8 +7092,33 @@
                 <w:rFonts w:ascii="Courier New" w:eastAsia="Courier New" w:hAnsi="Courier New" w:cs="Courier New"/>
                 <w:szCs w:val="36"/>
               </w:rPr>
-              <w:t>GET /api/admin/banned-emails</w:t>
-            </w:r>
+              <w:t>GET /</w:t>
+            </w:r>
+            <w:proofErr w:type="spellStart"/>
+            <w:r>
+              <w:rPr>
+                <w:rFonts w:ascii="Courier New" w:eastAsia="Courier New" w:hAnsi="Courier New" w:cs="Courier New"/>
+                <w:szCs w:val="36"/>
+              </w:rPr>
+              <w:t>api</w:t>
+            </w:r>
+            <w:proofErr w:type="spellEnd"/>
+            <w:r>
+              <w:rPr>
+                <w:rFonts w:ascii="Courier New" w:eastAsia="Courier New" w:hAnsi="Courier New" w:cs="Courier New"/>
+                <w:szCs w:val="36"/>
+              </w:rPr>
+              <w:t>/admin/</w:t>
+            </w:r>
+            <w:proofErr w:type="gramStart"/>
+            <w:r>
+              <w:rPr>
+                <w:rFonts w:ascii="Courier New" w:eastAsia="Courier New" w:hAnsi="Courier New" w:cs="Courier New"/>
+                <w:szCs w:val="36"/>
+              </w:rPr>
+              <w:t>banned-emails</w:t>
+            </w:r>
+            <w:proofErr w:type="gramEnd"/>
           </w:p>
         </w:tc>
         <w:tc>
@@ -5302,7 +7201,23 @@
                 <w:rFonts w:ascii="Courier New" w:eastAsia="Courier New" w:hAnsi="Courier New" w:cs="Courier New"/>
                 <w:szCs w:val="36"/>
               </w:rPr>
-              <w:t>DELETE /api/admin/users/:id</w:t>
+              <w:t>DELETE /</w:t>
+            </w:r>
+            <w:proofErr w:type="spellStart"/>
+            <w:r>
+              <w:rPr>
+                <w:rFonts w:ascii="Courier New" w:eastAsia="Courier New" w:hAnsi="Courier New" w:cs="Courier New"/>
+                <w:szCs w:val="36"/>
+              </w:rPr>
+              <w:t>api</w:t>
+            </w:r>
+            <w:proofErr w:type="spellEnd"/>
+            <w:r>
+              <w:rPr>
+                <w:rFonts w:ascii="Courier New" w:eastAsia="Courier New" w:hAnsi="Courier New" w:cs="Courier New"/>
+                <w:szCs w:val="36"/>
+              </w:rPr>
+              <w:t>/admin/users/:id</w:t>
             </w:r>
           </w:p>
         </w:tc>
@@ -5386,7 +7301,39 @@
                 <w:rFonts w:ascii="Courier New" w:eastAsia="Courier New" w:hAnsi="Courier New" w:cs="Courier New"/>
                 <w:szCs w:val="36"/>
               </w:rPr>
-              <w:t>GET /api/admin/audit?type=&amp;date=</w:t>
+              <w:t>GET /</w:t>
+            </w:r>
+            <w:proofErr w:type="spellStart"/>
+            <w:r>
+              <w:rPr>
+                <w:rFonts w:ascii="Courier New" w:eastAsia="Courier New" w:hAnsi="Courier New" w:cs="Courier New"/>
+                <w:szCs w:val="36"/>
+              </w:rPr>
+              <w:t>api</w:t>
+            </w:r>
+            <w:proofErr w:type="spellEnd"/>
+            <w:r>
+              <w:rPr>
+                <w:rFonts w:ascii="Courier New" w:eastAsia="Courier New" w:hAnsi="Courier New" w:cs="Courier New"/>
+                <w:szCs w:val="36"/>
+              </w:rPr>
+              <w:t>/admin/</w:t>
+            </w:r>
+            <w:proofErr w:type="spellStart"/>
+            <w:r>
+              <w:rPr>
+                <w:rFonts w:ascii="Courier New" w:eastAsia="Courier New" w:hAnsi="Courier New" w:cs="Courier New"/>
+                <w:szCs w:val="36"/>
+              </w:rPr>
+              <w:t>audit?type</w:t>
+            </w:r>
+            <w:proofErr w:type="spellEnd"/>
+            <w:r>
+              <w:rPr>
+                <w:rFonts w:ascii="Courier New" w:eastAsia="Courier New" w:hAnsi="Courier New" w:cs="Courier New"/>
+                <w:szCs w:val="36"/>
+              </w:rPr>
+              <w:t>=&amp;date=</w:t>
             </w:r>
           </w:p>
         </w:tc>
@@ -5684,11 +7631,33 @@
                 <w:szCs w:val="36"/>
               </w:rPr>
             </w:pPr>
-            <w:r>
-              <w:rPr>
-                <w:szCs w:val="36"/>
-              </w:rPr>
-              <w:t>channelId, userId, username</w:t>
+            <w:proofErr w:type="spellStart"/>
+            <w:r>
+              <w:rPr>
+                <w:szCs w:val="36"/>
+              </w:rPr>
+              <w:t>channelId</w:t>
+            </w:r>
+            <w:proofErr w:type="spellEnd"/>
+            <w:r>
+              <w:rPr>
+                <w:szCs w:val="36"/>
+              </w:rPr>
+              <w:t xml:space="preserve">, </w:t>
+            </w:r>
+            <w:proofErr w:type="spellStart"/>
+            <w:r>
+              <w:rPr>
+                <w:szCs w:val="36"/>
+              </w:rPr>
+              <w:t>userId</w:t>
+            </w:r>
+            <w:proofErr w:type="spellEnd"/>
+            <w:r>
+              <w:rPr>
+                <w:szCs w:val="36"/>
+              </w:rPr>
+              <w:t>, username</w:t>
             </w:r>
           </w:p>
         </w:tc>
@@ -5904,11 +7873,33 @@
                 <w:szCs w:val="36"/>
               </w:rPr>
             </w:pPr>
-            <w:r>
-              <w:rPr>
-                <w:szCs w:val="36"/>
-              </w:rPr>
-              <w:t>channelId, userId, username, text, optional image data URL</w:t>
+            <w:proofErr w:type="spellStart"/>
+            <w:r>
+              <w:rPr>
+                <w:szCs w:val="36"/>
+              </w:rPr>
+              <w:t>channelId</w:t>
+            </w:r>
+            <w:proofErr w:type="spellEnd"/>
+            <w:r>
+              <w:rPr>
+                <w:szCs w:val="36"/>
+              </w:rPr>
+              <w:t xml:space="preserve">, </w:t>
+            </w:r>
+            <w:proofErr w:type="spellStart"/>
+            <w:r>
+              <w:rPr>
+                <w:szCs w:val="36"/>
+              </w:rPr>
+              <w:t>userId</w:t>
+            </w:r>
+            <w:proofErr w:type="spellEnd"/>
+            <w:r>
+              <w:rPr>
+                <w:szCs w:val="36"/>
+              </w:rPr>
+              <w:t>, username, text, optional image data URL</w:t>
             </w:r>
           </w:p>
         </w:tc>
@@ -5976,6 +7967,7 @@
                 <w:szCs w:val="36"/>
               </w:rPr>
             </w:pPr>
+            <w:proofErr w:type="gramStart"/>
             <w:r>
               <w:rPr>
                 <w:rFonts w:ascii="Courier New" w:eastAsia="Courier New" w:hAnsi="Courier New" w:cs="Courier New"/>
@@ -5983,6 +7975,7 @@
               </w:rPr>
               <w:t>new-message</w:t>
             </w:r>
+            <w:proofErr w:type="gramEnd"/>
           </w:p>
         </w:tc>
         <w:tc>
@@ -6139,12 +8132,42 @@
                 <w:szCs w:val="36"/>
               </w:rPr>
             </w:pPr>
-            <w:r>
-              <w:rPr>
-                <w:szCs w:val="36"/>
-              </w:rPr>
-              <w:t>channelId, messageId, userId</w:t>
-            </w:r>
+            <w:proofErr w:type="spellStart"/>
+            <w:r>
+              <w:rPr>
+                <w:szCs w:val="36"/>
+              </w:rPr>
+              <w:t>channelId</w:t>
+            </w:r>
+            <w:proofErr w:type="spellEnd"/>
+            <w:r>
+              <w:rPr>
+                <w:szCs w:val="36"/>
+              </w:rPr>
+              <w:t xml:space="preserve">, </w:t>
+            </w:r>
+            <w:proofErr w:type="spellStart"/>
+            <w:r>
+              <w:rPr>
+                <w:szCs w:val="36"/>
+              </w:rPr>
+              <w:t>messageId</w:t>
+            </w:r>
+            <w:proofErr w:type="spellEnd"/>
+            <w:r>
+              <w:rPr>
+                <w:szCs w:val="36"/>
+              </w:rPr>
+              <w:t xml:space="preserve">, </w:t>
+            </w:r>
+            <w:proofErr w:type="spellStart"/>
+            <w:r>
+              <w:rPr>
+                <w:szCs w:val="36"/>
+              </w:rPr>
+              <w:t>userId</w:t>
+            </w:r>
+            <w:proofErr w:type="spellEnd"/>
           </w:p>
         </w:tc>
         <w:tc>
@@ -6249,12 +8272,14 @@
                 <w:szCs w:val="36"/>
               </w:rPr>
             </w:pPr>
+            <w:proofErr w:type="spellStart"/>
             <w:r>
               <w:rPr>
                 <w:szCs w:val="36"/>
               </w:rPr>
               <w:t>messageId</w:t>
             </w:r>
+            <w:proofErr w:type="spellEnd"/>
           </w:p>
         </w:tc>
         <w:tc>
@@ -6632,12 +8657,14 @@
       <w:r>
         <w:t xml:space="preserve">; it retrieves the user from MongoDB and stores the trusted username and profile-picture path on </w:t>
       </w:r>
+      <w:proofErr w:type="spellStart"/>
       <w:r>
         <w:rPr>
           <w:rFonts w:ascii="Courier New" w:eastAsia="Courier New" w:hAnsi="Courier New" w:cs="Courier New"/>
         </w:rPr>
         <w:t>socket.data</w:t>
       </w:r>
+      <w:proofErr w:type="spellEnd"/>
       <w:r>
         <w:t>. New messages therefore use server-known sender information.</w:t>
       </w:r>
@@ -6648,6 +8675,7 @@
         <w:ind w:left="-5"/>
       </w:pPr>
       <w:r>
+        <w:lastRenderedPageBreak/>
         <w:t>The server retains only five MongoDB message slots per channel. The open Angular component intentionally keeps additional messages received during that visit; after leaving/re-entering it receives only the five persistent slots.</w:t>
       </w:r>
     </w:p>
@@ -6657,7 +8685,6 @@
         <w:ind w:left="-5"/>
       </w:pPr>
       <w:r>
-        <w:lastRenderedPageBreak/>
         <w:t>Presence uses a connection counter rather than a simple Boolean so multiple active sockets belonging to one user do not incorrectly mark that user offline when only one connection closes.</w:t>
       </w:r>
     </w:p>
@@ -6669,12 +8696,14 @@
       <w:r>
         <w:t xml:space="preserve">Socket.io </w:t>
       </w:r>
+      <w:proofErr w:type="spellStart"/>
       <w:r>
         <w:rPr>
           <w:rFonts w:ascii="Courier New" w:eastAsia="Courier New" w:hAnsi="Courier New" w:cs="Courier New"/>
         </w:rPr>
         <w:t>maxHttpBufferSize</w:t>
       </w:r>
+      <w:proofErr w:type="spellEnd"/>
       <w:r>
         <w:t xml:space="preserve"> is configured at the server level to allow the Base64 transport representation of a valid image near 2 MB. Application validation still rejects decoded images above 2 MB and accepts only PNG, JPEG and GIF.</w:t>
       </w:r>
@@ -6694,7 +8723,15 @@
         <w:ind w:left="-5"/>
       </w:pPr>
       <w:r>
-        <w:t>Validation occurs on both sides where practical. Angular prevents empty submissions and validates image selection; Express/Socket.io repeat important checks because browser controls can be bypassed. The server checks authentication, Super Admin/group-admin authority, membership, age limits, last-admin invariants, duplicate/banned emails, image MIME/size and message ownership. Passwords use bcrypt hashes. Safe-user helpers prevent hashes from leaving the server. Profile uploads use an allow-list and 2 MB Multer limit. Chat images are allow-listed and decoded-size checked again by the socket server. MongoDB is indexed for common lookups and only the five required chat slots are retained, limiting unbounded persistent message growth.</w:t>
+        <w:t xml:space="preserve">Validation occurs on both sides where practical. Angular prevents empty submissions and validates image selection; Express/Socket.io repeat important checks because browser controls can be bypassed. The server checks authentication, Super Admin/group-admin authority, membership, age limits, last-admin invariants, duplicate/banned emails, image MIME/size and message ownership. Passwords use </w:t>
+      </w:r>
+      <w:proofErr w:type="spellStart"/>
+      <w:r>
+        <w:t>bcrypt</w:t>
+      </w:r>
+      <w:proofErr w:type="spellEnd"/>
+      <w:r>
+        <w:t xml:space="preserve"> hashes. Safe-user helpers prevent hashes from leaving the server. Profile uploads use an allow-list and 2 MB Multer limit. Chat images are allow-listed and decoded-size checked again by the socket server. MongoDB is indexed for common lookups and only the five required chat slots are retained, limiting unbounded persistent message growth.</w:t>
       </w:r>
     </w:p>
     <w:p>
@@ -6705,21 +8742,25 @@
       <w:r>
         <w:t xml:space="preserve">Permanent account deletion records the email in </w:t>
       </w:r>
+      <w:proofErr w:type="spellStart"/>
       <w:r>
         <w:rPr>
           <w:rFonts w:ascii="Courier New" w:eastAsia="Courier New" w:hAnsi="Courier New" w:cs="Courier New"/>
         </w:rPr>
         <w:t>banned_emails</w:t>
       </w:r>
+      <w:proofErr w:type="spellEnd"/>
       <w:r>
         <w:t xml:space="preserve">, preventing that address from being reused. Administrative mutations are recorded in </w:t>
       </w:r>
+      <w:proofErr w:type="spellStart"/>
       <w:r>
         <w:rPr>
           <w:rFonts w:ascii="Courier New" w:eastAsia="Courier New" w:hAnsi="Courier New" w:cs="Courier New"/>
         </w:rPr>
         <w:t>audit_logs</w:t>
       </w:r>
+      <w:proofErr w:type="spellEnd"/>
       <w:r>
         <w:t>, and the Super Admin interface supports action/date filtering.</w:t>
       </w:r>
@@ -6739,7 +8780,15 @@
         <w:t>x-user-id</w:t>
       </w:r>
       <w:r>
-        <w:t xml:space="preserve"> is the session identity mechanism rather than a production cookie/token session. Security-critical permissions are nevertheless rechecked against MongoDB on every protected REST mutation and against channel membership when a socket joins. A production deployment would replace this identity header with signed HttpOnly session cookies/JWT transport and HTTPS.</w:t>
+        <w:t xml:space="preserve"> is the session identity mechanism rather than a production cookie/token session. Security-critical permissions are nevertheless rechecked against MongoDB on every protected REST mutation and against channel membership when a socket joins. A production deployment would replace this identity header with signed </w:t>
+      </w:r>
+      <w:proofErr w:type="spellStart"/>
+      <w:r>
+        <w:t>HttpOnly</w:t>
+      </w:r>
+      <w:proofErr w:type="spellEnd"/>
+      <w:r>
+        <w:t xml:space="preserve"> session cookies/JWT transport and HTTPS.</w:t>
       </w:r>
     </w:p>
     <w:p>
@@ -6777,20 +8826,58 @@
       <w:r>
         <w:t xml:space="preserve"> </w:t>
       </w:r>
+      <w:proofErr w:type="spellStart"/>
       <w:r>
         <w:rPr>
           <w:rFonts w:ascii="Courier New" w:eastAsia="Courier New" w:hAnsi="Courier New" w:cs="Courier New"/>
         </w:rPr>
-        <w:t>src/app/**/*.spec.ts</w:t>
-      </w:r>
+        <w:t>src</w:t>
+      </w:r>
+      <w:proofErr w:type="spellEnd"/>
+      <w:r>
+        <w:rPr>
+          <w:rFonts w:ascii="Courier New" w:eastAsia="Courier New" w:hAnsi="Courier New" w:cs="Courier New"/>
+        </w:rPr>
+        <w:t>/app/**/</w:t>
+      </w:r>
+      <w:proofErr w:type="gramStart"/>
+      <w:r>
+        <w:rPr>
+          <w:rFonts w:ascii="Courier New" w:eastAsia="Courier New" w:hAnsi="Courier New" w:cs="Courier New"/>
+        </w:rPr>
+        <w:t>*.</w:t>
+      </w:r>
+      <w:proofErr w:type="spellStart"/>
+      <w:r>
+        <w:rPr>
+          <w:rFonts w:ascii="Courier New" w:eastAsia="Courier New" w:hAnsi="Courier New" w:cs="Courier New"/>
+        </w:rPr>
+        <w:t>spec</w:t>
+      </w:r>
+      <w:proofErr w:type="gramEnd"/>
+      <w:r>
+        <w:rPr>
+          <w:rFonts w:ascii="Courier New" w:eastAsia="Courier New" w:hAnsi="Courier New" w:cs="Courier New"/>
+        </w:rPr>
+        <w:t>.ts</w:t>
+      </w:r>
+      <w:proofErr w:type="spellEnd"/>
       <w:r>
         <w:t xml:space="preserve">, run with </w:t>
       </w:r>
+      <w:proofErr w:type="spellStart"/>
       <w:r>
         <w:rPr>
           <w:rFonts w:ascii="Courier New" w:eastAsia="Courier New" w:hAnsi="Courier New" w:cs="Courier New"/>
         </w:rPr>
-        <w:t>npm test</w:t>
+        <w:t>npm</w:t>
+      </w:r>
+      <w:proofErr w:type="spellEnd"/>
+      <w:r>
+        <w:rPr>
+          <w:rFonts w:ascii="Courier New" w:eastAsia="Courier New" w:hAnsi="Courier New" w:cs="Courier New"/>
+        </w:rPr>
+        <w:t xml:space="preserve"> test</w:t>
       </w:r>
       <w:r>
         <w:t>.</w:t>
@@ -6826,7 +8913,21 @@
         <w:rPr>
           <w:rFonts w:ascii="Courier New" w:eastAsia="Courier New" w:hAnsi="Courier New" w:cs="Courier New"/>
         </w:rPr>
-        <w:t>cd server &amp;&amp; npm test</w:t>
+        <w:t xml:space="preserve">cd server &amp;&amp; </w:t>
+      </w:r>
+      <w:proofErr w:type="spellStart"/>
+      <w:r>
+        <w:rPr>
+          <w:rFonts w:ascii="Courier New" w:eastAsia="Courier New" w:hAnsi="Courier New" w:cs="Courier New"/>
+        </w:rPr>
+        <w:t>npm</w:t>
+      </w:r>
+      <w:proofErr w:type="spellEnd"/>
+      <w:r>
+        <w:rPr>
+          <w:rFonts w:ascii="Courier New" w:eastAsia="Courier New" w:hAnsi="Courier New" w:cs="Courier New"/>
+        </w:rPr>
+        <w:t xml:space="preserve"> test</w:t>
       </w:r>
       <w:r>
         <w:t>. These cover DOB/public-user safety and chat-image validation boundaries.</w:t>
@@ -6853,25 +8954,63 @@
         <w:rPr>
           <w:rFonts w:ascii="Courier New" w:eastAsia="Courier New" w:hAnsi="Courier New" w:cs="Courier New"/>
         </w:rPr>
-        <w:t>e2e/public-navigation.spec.ts</w:t>
-      </w:r>
+        <w:t>e2e/public-</w:t>
+      </w:r>
+      <w:proofErr w:type="spellStart"/>
+      <w:r>
+        <w:rPr>
+          <w:rFonts w:ascii="Courier New" w:eastAsia="Courier New" w:hAnsi="Courier New" w:cs="Courier New"/>
+        </w:rPr>
+        <w:t>navigation.spec.ts</w:t>
+      </w:r>
+      <w:proofErr w:type="spellEnd"/>
       <w:r>
         <w:t xml:space="preserve">, run with </w:t>
       </w:r>
+      <w:proofErr w:type="spellStart"/>
       <w:r>
         <w:rPr>
           <w:rFonts w:ascii="Courier New" w:eastAsia="Courier New" w:hAnsi="Courier New" w:cs="Courier New"/>
         </w:rPr>
-        <w:t>npm run test:e2e</w:t>
+        <w:t>npm</w:t>
+      </w:r>
+      <w:proofErr w:type="spellEnd"/>
+      <w:r>
+        <w:rPr>
+          <w:rFonts w:ascii="Courier New" w:eastAsia="Courier New" w:hAnsi="Courier New" w:cs="Courier New"/>
+        </w:rPr>
+        <w:t xml:space="preserve"> run </w:t>
+      </w:r>
+      <w:proofErr w:type="gramStart"/>
+      <w:r>
+        <w:rPr>
+          <w:rFonts w:ascii="Courier New" w:eastAsia="Courier New" w:hAnsi="Courier New" w:cs="Courier New"/>
+        </w:rPr>
+        <w:t>test:e</w:t>
+      </w:r>
+      <w:proofErr w:type="gramEnd"/>
+      <w:r>
+        <w:rPr>
+          <w:rFonts w:ascii="Courier New" w:eastAsia="Courier New" w:hAnsi="Courier New" w:cs="Courier New"/>
+        </w:rPr>
+        <w:t>2e</w:t>
       </w:r>
       <w:r>
         <w:t xml:space="preserve">. It verifies public branding and protected-route redirection. Install browser once with </w:t>
       </w:r>
+      <w:proofErr w:type="spellStart"/>
       <w:r>
         <w:rPr>
           <w:rFonts w:ascii="Courier New" w:eastAsia="Courier New" w:hAnsi="Courier New" w:cs="Courier New"/>
         </w:rPr>
-        <w:t>npx playwright install chromium</w:t>
+        <w:t>npx</w:t>
+      </w:r>
+      <w:proofErr w:type="spellEnd"/>
+      <w:r>
+        <w:rPr>
+          <w:rFonts w:ascii="Courier New" w:eastAsia="Courier New" w:hAnsi="Courier New" w:cs="Courier New"/>
+        </w:rPr>
+        <w:t xml:space="preserve"> playwright install chromium</w:t>
       </w:r>
       <w:r>
         <w:t>.</w:t>
@@ -6960,8 +9099,13 @@
         </w:numPr>
         <w:spacing w:line="271" w:lineRule="auto"/>
       </w:pPr>
-      <w:r>
-        <w:t>Channel create, inline rename/cancel and delete update the UI and create the expected audit records.</w:t>
+      <w:proofErr w:type="gramStart"/>
+      <w:r>
+        <w:t>Channel</w:t>
+      </w:r>
+      <w:proofErr w:type="gramEnd"/>
+      <w:r>
+        <w:t xml:space="preserve"> create, inline rename/cancel and delete update the UI and create the expected audit records.</w:t>
       </w:r>
     </w:p>
     <w:p>
@@ -6973,7 +9117,23 @@
         <w:spacing w:line="271" w:lineRule="auto"/>
       </w:pPr>
       <w:r>
-        <w:t>Join requests can be submitted, approved or rejected. Approval grants group/channel access; rejection leaves the requester outside thegroup; duplicate pending requests are prevented and success/error feedback is human-readable.</w:t>
+        <w:t xml:space="preserve">Join requests can be submitted, approved or rejected. Approval grants group/channel access; rejection leaves the requester outside </w:t>
+      </w:r>
+      <w:proofErr w:type="spellStart"/>
+      <w:r>
+        <w:t>thegroup</w:t>
+      </w:r>
+      <w:proofErr w:type="spellEnd"/>
+      <w:r>
+        <w:t xml:space="preserve">; duplicate pending requests are </w:t>
+      </w:r>
+      <w:proofErr w:type="gramStart"/>
+      <w:r>
+        <w:t>prevented</w:t>
+      </w:r>
+      <w:proofErr w:type="gramEnd"/>
+      <w:r>
+        <w:t xml:space="preserve"> and success/error feedback is human-readable.</w:t>
       </w:r>
     </w:p>
     <w:p>
@@ -6997,7 +9157,15 @@
         <w:spacing w:line="271" w:lineRule="auto"/>
       </w:pPr>
       <w:r>
-        <w:t>More than five messages remain visible during the current chat visit, while leaving/re-entering reloads only the newest five persistedmessages.</w:t>
+        <w:t xml:space="preserve">More than five messages remain visible during the current chat visit, while leaving/re-entering reloads only the newest five </w:t>
+      </w:r>
+      <w:proofErr w:type="spellStart"/>
+      <w:r>
+        <w:t>persistedmessages</w:t>
+      </w:r>
+      <w:proofErr w:type="spellEnd"/>
+      <w:r>
+        <w:t>.</w:t>
       </w:r>
     </w:p>
     <w:p>
@@ -7021,7 +9189,15 @@
         <w:spacing w:line="271" w:lineRule="auto"/>
       </w:pPr>
       <w:r>
-        <w:t>PNG, JPEG and GIF chat images work. Unsupported files and images above 2 MB are rejected with friendly feedback, while a validimage close to the 2 MB boundary is accepted.</w:t>
+        <w:t xml:space="preserve">PNG, JPEG and GIF chat images work. Unsupported files and images above 2 MB are rejected with friendly feedback, while a </w:t>
+      </w:r>
+      <w:proofErr w:type="spellStart"/>
+      <w:r>
+        <w:t>validimage</w:t>
+      </w:r>
+      <w:proofErr w:type="spellEnd"/>
+      <w:r>
+        <w:t xml:space="preserve"> close to the 2 MB boundary is accepted.</w:t>
       </w:r>
     </w:p>
     <w:p>
@@ -7033,7 +9209,16 @@
         <w:spacing w:line="271" w:lineRule="auto"/>
       </w:pPr>
       <w:r>
-        <w:t>Profile pictures persist and display on profile/home pages and beside chat messages; users without an uploaded image receive thedefault avatar.</w:t>
+        <w:lastRenderedPageBreak/>
+        <w:t xml:space="preserve">Profile pictures persist and display on profile/home pages and beside chat messages; users without an uploaded image receive </w:t>
+      </w:r>
+      <w:proofErr w:type="spellStart"/>
+      <w:r>
+        <w:t>thedefault</w:t>
+      </w:r>
+      <w:proofErr w:type="spellEnd"/>
+      <w:r>
+        <w:t xml:space="preserve"> avatar.</w:t>
       </w:r>
     </w:p>
     <w:p>
@@ -7045,7 +9230,6 @@
         <w:spacing w:line="271" w:lineRule="auto"/>
       </w:pPr>
       <w:r>
-        <w:lastRenderedPageBreak/>
         <w:t>Online/offline indicators update from live Socket.io presence state.</w:t>
       </w:r>
     </w:p>
@@ -7058,7 +9242,15 @@
         <w:spacing w:after="221" w:line="271" w:lineRule="auto"/>
       </w:pPr>
       <w:r>
-        <w:t>After shutting down and restarting the application, MongoDB still retains users, groups, memberships, channels, profile-picture paths andthe latest five chat messages.</w:t>
+        <w:t xml:space="preserve">After shutting down and restarting the application, MongoDB still retains users, groups, memberships, channels, profile-picture paths </w:t>
+      </w:r>
+      <w:proofErr w:type="spellStart"/>
+      <w:r>
+        <w:t>andthe</w:t>
+      </w:r>
+      <w:proofErr w:type="spellEnd"/>
+      <w:r>
+        <w:t xml:space="preserve"> latest five chat messages.</w:t>
       </w:r>
     </w:p>
     <w:p>
@@ -7079,133 +9271,416 @@
     </w:p>
     <w:p>
       <w:pPr>
-        <w:spacing w:after="172" w:line="265" w:lineRule="auto"/>
-        <w:ind w:left="75" w:right="6830"/>
+        <w:pStyle w:val="NoSpacing"/>
+        <w:ind w:left="50"/>
+        <w:rPr>
+          <w:rFonts w:ascii="Courier New" w:hAnsi="Courier New" w:cs="Courier New"/>
+        </w:rPr>
+      </w:pPr>
+      <w:r>
+        <w:rPr>
+          <w:rFonts w:ascii="Courier New" w:hAnsi="Courier New" w:cs="Courier New"/>
+        </w:rPr>
+        <w:t># Terminal 1 – MongoDB service running</w:t>
+      </w:r>
+    </w:p>
+    <w:p>
+      <w:pPr>
+        <w:pStyle w:val="NoSpacing"/>
+        <w:ind w:left="50"/>
+        <w:rPr>
+          <w:rFonts w:ascii="Courier New" w:hAnsi="Courier New" w:cs="Courier New"/>
+        </w:rPr>
+      </w:pPr>
+      <w:r>
+        <w:rPr>
+          <w:rFonts w:ascii="Courier New" w:hAnsi="Courier New" w:cs="Courier New"/>
+        </w:rPr>
+        <w:t># Terminal 2</w:t>
+      </w:r>
+    </w:p>
+    <w:p>
+      <w:pPr>
+        <w:pStyle w:val="NoSpacing"/>
+        <w:ind w:left="50"/>
+        <w:rPr>
+          <w:rFonts w:ascii="Courier New" w:hAnsi="Courier New" w:cs="Courier New"/>
+        </w:rPr>
+      </w:pPr>
+      <w:r>
+        <w:rPr>
+          <w:rFonts w:ascii="Courier New" w:hAnsi="Courier New" w:cs="Courier New"/>
+        </w:rPr>
+        <w:t>cd server</w:t>
+      </w:r>
+    </w:p>
+    <w:p>
+      <w:pPr>
+        <w:pStyle w:val="NoSpacing"/>
+        <w:ind w:left="50"/>
+        <w:rPr>
+          <w:rFonts w:ascii="Courier New" w:hAnsi="Courier New" w:cs="Courier New"/>
+        </w:rPr>
+      </w:pPr>
+      <w:proofErr w:type="spellStart"/>
+      <w:r>
+        <w:rPr>
+          <w:rFonts w:ascii="Courier New" w:hAnsi="Courier New" w:cs="Courier New"/>
+        </w:rPr>
+        <w:t>npm</w:t>
+      </w:r>
+      <w:proofErr w:type="spellEnd"/>
+      <w:r>
+        <w:rPr>
+          <w:rFonts w:ascii="Courier New" w:hAnsi="Courier New" w:cs="Courier New"/>
+        </w:rPr>
+        <w:t xml:space="preserve"> install</w:t>
+      </w:r>
+    </w:p>
+    <w:p>
+      <w:pPr>
+        <w:pStyle w:val="NoSpacing"/>
+        <w:ind w:left="50"/>
+        <w:rPr>
+          <w:rFonts w:ascii="Courier New" w:hAnsi="Courier New" w:cs="Courier New"/>
+        </w:rPr>
+      </w:pPr>
+      <w:proofErr w:type="spellStart"/>
+      <w:r>
+        <w:rPr>
+          <w:rFonts w:ascii="Courier New" w:hAnsi="Courier New" w:cs="Courier New"/>
+        </w:rPr>
+        <w:t>npm</w:t>
+      </w:r>
+      <w:proofErr w:type="spellEnd"/>
+      <w:r>
+        <w:rPr>
+          <w:rFonts w:ascii="Courier New" w:hAnsi="Courier New" w:cs="Courier New"/>
+        </w:rPr>
+        <w:t xml:space="preserve"> test</w:t>
+      </w:r>
+    </w:p>
+    <w:p>
+      <w:pPr>
+        <w:pStyle w:val="NoSpacing"/>
+        <w:ind w:left="50"/>
+        <w:rPr>
+          <w:rFonts w:ascii="Courier New" w:hAnsi="Courier New" w:cs="Courier New"/>
+        </w:rPr>
+      </w:pPr>
+      <w:proofErr w:type="spellStart"/>
+      <w:r>
+        <w:rPr>
+          <w:rFonts w:ascii="Courier New" w:hAnsi="Courier New" w:cs="Courier New"/>
+        </w:rPr>
+        <w:t>npm</w:t>
+      </w:r>
+      <w:proofErr w:type="spellEnd"/>
+      <w:r>
+        <w:rPr>
+          <w:rFonts w:ascii="Courier New" w:hAnsi="Courier New" w:cs="Courier New"/>
+        </w:rPr>
+        <w:t xml:space="preserve"> run inspect</w:t>
+      </w:r>
+    </w:p>
+    <w:p>
+      <w:pPr>
+        <w:pStyle w:val="NoSpacing"/>
+        <w:ind w:left="50"/>
+        <w:rPr>
+          <w:rFonts w:ascii="Courier New" w:hAnsi="Courier New" w:cs="Courier New"/>
+        </w:rPr>
+      </w:pPr>
+      <w:proofErr w:type="spellStart"/>
+      <w:r>
+        <w:rPr>
+          <w:rFonts w:ascii="Courier New" w:hAnsi="Courier New" w:cs="Courier New"/>
+        </w:rPr>
+        <w:t>npm</w:t>
+      </w:r>
+      <w:proofErr w:type="spellEnd"/>
+      <w:r>
+        <w:rPr>
+          <w:rFonts w:ascii="Courier New" w:hAnsi="Courier New" w:cs="Courier New"/>
+        </w:rPr>
+        <w:t xml:space="preserve"> start</w:t>
+      </w:r>
+    </w:p>
+    <w:p>
+      <w:pPr>
+        <w:pStyle w:val="NoSpacing"/>
+        <w:ind w:left="50"/>
+        <w:rPr>
+          <w:rFonts w:ascii="Courier New" w:hAnsi="Courier New" w:cs="Courier New"/>
+        </w:rPr>
+      </w:pPr>
+    </w:p>
+    <w:p>
+      <w:pPr>
+        <w:pStyle w:val="NoSpacing"/>
+        <w:ind w:left="50"/>
+        <w:rPr>
+          <w:rFonts w:ascii="Courier New" w:hAnsi="Courier New" w:cs="Courier New"/>
+        </w:rPr>
+      </w:pPr>
+      <w:r>
+        <w:rPr>
+          <w:rFonts w:ascii="Courier New" w:hAnsi="Courier New" w:cs="Courier New"/>
+        </w:rPr>
+        <w:t># Terminal 3 (project root)</w:t>
+      </w:r>
+    </w:p>
+    <w:p>
+      <w:pPr>
+        <w:pStyle w:val="NoSpacing"/>
+        <w:ind w:left="50"/>
+        <w:rPr>
+          <w:rFonts w:ascii="Courier New" w:hAnsi="Courier New" w:cs="Courier New"/>
+        </w:rPr>
+      </w:pPr>
+      <w:proofErr w:type="spellStart"/>
+      <w:r>
+        <w:rPr>
+          <w:rFonts w:ascii="Courier New" w:hAnsi="Courier New" w:cs="Courier New"/>
+        </w:rPr>
+        <w:t>npm</w:t>
+      </w:r>
+      <w:proofErr w:type="spellEnd"/>
+      <w:r>
+        <w:rPr>
+          <w:rFonts w:ascii="Courier New" w:hAnsi="Courier New" w:cs="Courier New"/>
+        </w:rPr>
+        <w:t xml:space="preserve"> install</w:t>
+      </w:r>
+    </w:p>
+    <w:p>
+      <w:pPr>
+        <w:pStyle w:val="NoSpacing"/>
+        <w:ind w:left="50"/>
+        <w:rPr>
+          <w:rFonts w:ascii="Courier New" w:hAnsi="Courier New" w:cs="Courier New"/>
+        </w:rPr>
+      </w:pPr>
+      <w:proofErr w:type="spellStart"/>
+      <w:r>
+        <w:rPr>
+          <w:rFonts w:ascii="Courier New" w:hAnsi="Courier New" w:cs="Courier New"/>
+        </w:rPr>
+        <w:t>npm</w:t>
+      </w:r>
+      <w:proofErr w:type="spellEnd"/>
+      <w:r>
+        <w:rPr>
+          <w:rFonts w:ascii="Courier New" w:hAnsi="Courier New" w:cs="Courier New"/>
+        </w:rPr>
+        <w:t xml:space="preserve"> test</w:t>
+      </w:r>
+    </w:p>
+    <w:p>
+      <w:pPr>
+        <w:pStyle w:val="NoSpacing"/>
+        <w:ind w:left="50"/>
+        <w:rPr>
+          <w:rFonts w:ascii="Courier New" w:hAnsi="Courier New" w:cs="Courier New"/>
+        </w:rPr>
+      </w:pPr>
+      <w:proofErr w:type="spellStart"/>
+      <w:r>
+        <w:rPr>
+          <w:rFonts w:ascii="Courier New" w:hAnsi="Courier New" w:cs="Courier New"/>
+        </w:rPr>
+        <w:t>npm</w:t>
+      </w:r>
+      <w:proofErr w:type="spellEnd"/>
+      <w:r>
+        <w:rPr>
+          <w:rFonts w:ascii="Courier New" w:hAnsi="Courier New" w:cs="Courier New"/>
+        </w:rPr>
+        <w:t xml:space="preserve"> run build</w:t>
+      </w:r>
+    </w:p>
+    <w:p>
+      <w:pPr>
+        <w:pStyle w:val="NoSpacing"/>
+        <w:ind w:left="50"/>
+        <w:rPr>
+          <w:rFonts w:ascii="Courier New" w:hAnsi="Courier New" w:cs="Courier New"/>
+        </w:rPr>
+      </w:pPr>
+      <w:proofErr w:type="spellStart"/>
+      <w:r>
+        <w:rPr>
+          <w:rFonts w:ascii="Courier New" w:hAnsi="Courier New" w:cs="Courier New"/>
+        </w:rPr>
+        <w:t>npm</w:t>
+      </w:r>
+      <w:proofErr w:type="spellEnd"/>
+      <w:r>
+        <w:rPr>
+          <w:rFonts w:ascii="Courier New" w:hAnsi="Courier New" w:cs="Courier New"/>
+        </w:rPr>
+        <w:t xml:space="preserve"> start</w:t>
+      </w:r>
+    </w:p>
+    <w:p>
+      <w:pPr>
+        <w:pStyle w:val="NoSpacing"/>
+        <w:ind w:left="50"/>
+        <w:rPr>
+          <w:rFonts w:ascii="Courier New" w:hAnsi="Courier New" w:cs="Courier New"/>
+        </w:rPr>
+      </w:pPr>
+    </w:p>
+    <w:p>
+      <w:pPr>
+        <w:pStyle w:val="NoSpacing"/>
+        <w:ind w:left="50"/>
+        <w:rPr>
+          <w:rFonts w:ascii="Courier New" w:hAnsi="Courier New" w:cs="Courier New"/>
+        </w:rPr>
+      </w:pPr>
+      <w:r>
+        <w:rPr>
+          <w:rFonts w:ascii="Courier New" w:hAnsi="Courier New" w:cs="Courier New"/>
+        </w:rPr>
+        <w:t># Optional E2E once Chromium is installed</w:t>
+      </w:r>
+    </w:p>
+    <w:p>
+      <w:pPr>
+        <w:pStyle w:val="NoSpacing"/>
+        <w:ind w:left="50"/>
+        <w:rPr>
+          <w:rFonts w:ascii="Courier New" w:hAnsi="Courier New" w:cs="Courier New"/>
+        </w:rPr>
+      </w:pPr>
+      <w:proofErr w:type="spellStart"/>
+      <w:r>
+        <w:rPr>
+          <w:rFonts w:ascii="Courier New" w:hAnsi="Courier New" w:cs="Courier New"/>
+        </w:rPr>
+        <w:t>npm</w:t>
+      </w:r>
+      <w:proofErr w:type="spellEnd"/>
+      <w:r>
+        <w:rPr>
+          <w:rFonts w:ascii="Courier New" w:hAnsi="Courier New" w:cs="Courier New"/>
+        </w:rPr>
+        <w:t xml:space="preserve"> run </w:t>
+      </w:r>
+      <w:proofErr w:type="gramStart"/>
+      <w:r>
+        <w:rPr>
+          <w:rFonts w:ascii="Courier New" w:hAnsi="Courier New" w:cs="Courier New"/>
+        </w:rPr>
+        <w:t>test:e</w:t>
+      </w:r>
+      <w:proofErr w:type="gramEnd"/>
+      <w:r>
+        <w:rPr>
+          <w:rFonts w:ascii="Courier New" w:hAnsi="Courier New" w:cs="Courier New"/>
+        </w:rPr>
+        <w:t>2e</w:t>
+      </w:r>
+    </w:p>
+    <w:p>
+      <w:pPr>
+        <w:pStyle w:val="NoSpacing"/>
+        <w:ind w:left="50"/>
+        <w:rPr>
+          <w:rFonts w:ascii="Courier New" w:hAnsi="Courier New" w:cs="Courier New"/>
+        </w:rPr>
+      </w:pPr>
+    </w:p>
+    <w:p>
+      <w:pPr>
+        <w:pStyle w:val="NoSpacing"/>
+        <w:ind w:left="50"/>
+        <w:rPr>
+          <w:rFonts w:ascii="Courier New" w:hAnsi="Courier New" w:cs="Courier New"/>
+        </w:rPr>
+      </w:pPr>
+      <w:r>
+        <w:rPr>
+          <w:rFonts w:ascii="Courier New" w:hAnsi="Courier New" w:cs="Courier New"/>
+        </w:rPr>
+        <w:t># Direct database demonstration</w:t>
+      </w:r>
+    </w:p>
+    <w:p>
+      <w:pPr>
+        <w:pStyle w:val="NoSpacing"/>
+        <w:ind w:left="50"/>
+        <w:rPr>
+          <w:rFonts w:ascii="Courier New" w:hAnsi="Courier New" w:cs="Courier New"/>
+        </w:rPr>
+      </w:pPr>
+      <w:r>
+        <w:rPr>
+          <w:rFonts w:ascii="Courier New" w:hAnsi="Courier New" w:cs="Courier New"/>
+        </w:rPr>
+        <w:t>cd server</w:t>
+      </w:r>
+    </w:p>
+    <w:p>
+      <w:pPr>
+        <w:pStyle w:val="NoSpacing"/>
+        <w:ind w:left="50"/>
+        <w:rPr>
+          <w:rFonts w:ascii="Courier New" w:hAnsi="Courier New" w:cs="Courier New"/>
+        </w:rPr>
+      </w:pPr>
+      <w:proofErr w:type="spellStart"/>
+      <w:r>
+        <w:rPr>
+          <w:rFonts w:ascii="Courier New" w:hAnsi="Courier New" w:cs="Courier New"/>
+        </w:rPr>
+        <w:t>npm</w:t>
+      </w:r>
+      <w:proofErr w:type="spellEnd"/>
+      <w:r>
+        <w:rPr>
+          <w:rFonts w:ascii="Courier New" w:hAnsi="Courier New" w:cs="Courier New"/>
+        </w:rPr>
+        <w:t xml:space="preserve"> run inspect</w:t>
+      </w:r>
+    </w:p>
+    <w:p>
+      <w:pPr>
+        <w:spacing w:after="346"/>
+        <w:ind w:left="-5"/>
         <w:rPr>
           <w:rFonts w:ascii="Courier New" w:eastAsia="Courier New" w:hAnsi="Courier New" w:cs="Courier New"/>
           <w:szCs w:val="36"/>
         </w:rPr>
       </w:pPr>
-      <w:r>
-        <w:rPr>
-          <w:rFonts w:ascii="Courier New" w:eastAsia="Courier New" w:hAnsi="Courier New" w:cs="Courier New"/>
-          <w:szCs w:val="36"/>
-        </w:rPr>
-        <w:t xml:space="preserve"># Terminal 1 </w:t>
-      </w:r>
-      <w:r>
-        <w:rPr>
-          <w:rFonts w:ascii="Courier New" w:eastAsia="Courier New" w:hAnsi="Courier New" w:cs="Courier New"/>
-          <w:szCs w:val="36"/>
-        </w:rPr>
-        <w:t>-</w:t>
-      </w:r>
-      <w:r>
-        <w:rPr>
-          <w:rFonts w:ascii="Courier New" w:eastAsia="Courier New" w:hAnsi="Courier New" w:cs="Courier New"/>
-          <w:szCs w:val="36"/>
-        </w:rPr>
-        <w:t xml:space="preserve"> MongoDB service running</w:t>
-      </w:r>
     </w:p>
     <w:p>
       <w:pPr>
-        <w:spacing w:after="172" w:line="265" w:lineRule="auto"/>
-        <w:ind w:left="75" w:right="6830"/>
-        <w:rPr>
-          <w:sz w:val="24"/>
-          <w:szCs w:val="36"/>
-        </w:rPr>
-      </w:pPr>
-      <w:r>
-        <w:rPr>
-          <w:rFonts w:ascii="Courier New" w:eastAsia="Courier New" w:hAnsi="Courier New" w:cs="Courier New"/>
-          <w:szCs w:val="36"/>
-        </w:rPr>
-        <w:t># Terminal 2 cd server npm install npm test npm run inspect npm start</w:t>
-      </w:r>
-    </w:p>
-    <w:p>
-      <w:pPr>
-        <w:spacing w:after="5" w:line="265" w:lineRule="auto"/>
-        <w:ind w:left="75" w:right="7714"/>
-        <w:rPr>
-          <w:sz w:val="24"/>
-          <w:szCs w:val="36"/>
-        </w:rPr>
-      </w:pPr>
-      <w:r>
-        <w:rPr>
-          <w:rFonts w:ascii="Courier New" w:eastAsia="Courier New" w:hAnsi="Courier New" w:cs="Courier New"/>
-          <w:szCs w:val="36"/>
-        </w:rPr>
-        <w:t># Terminal 3 (project</w:t>
-      </w:r>
-      <w:r>
-        <w:rPr>
-          <w:rFonts w:ascii="Courier New" w:eastAsia="Courier New" w:hAnsi="Courier New" w:cs="Courier New"/>
-          <w:szCs w:val="36"/>
-        </w:rPr>
-        <w:t xml:space="preserve"> </w:t>
-      </w:r>
-      <w:r>
-        <w:rPr>
-          <w:rFonts w:ascii="Courier New" w:eastAsia="Courier New" w:hAnsi="Courier New" w:cs="Courier New"/>
-          <w:szCs w:val="36"/>
-        </w:rPr>
-        <w:t>root) npm install npm test npm run build npm start</w:t>
-      </w:r>
-    </w:p>
-    <w:p>
-      <w:pPr>
-        <w:spacing w:after="172" w:line="265" w:lineRule="auto"/>
-        <w:ind w:left="75" w:right="6347"/>
-        <w:rPr>
-          <w:sz w:val="24"/>
-          <w:szCs w:val="36"/>
-        </w:rPr>
-      </w:pPr>
-      <w:r>
-        <w:rPr>
-          <w:rFonts w:ascii="Courier New" w:eastAsia="Courier New" w:hAnsi="Courier New" w:cs="Courier New"/>
-          <w:szCs w:val="36"/>
-        </w:rPr>
-        <w:t># Optional E2E once Chromium is installed npm run test:e2e</w:t>
-      </w:r>
-    </w:p>
-    <w:p>
-      <w:pPr>
-        <w:spacing w:after="312" w:line="265" w:lineRule="auto"/>
-        <w:ind w:left="75" w:right="7392"/>
-        <w:rPr>
-          <w:sz w:val="24"/>
-          <w:szCs w:val="36"/>
-        </w:rPr>
-      </w:pPr>
-      <w:r>
-        <w:rPr>
-          <w:rFonts w:ascii="Courier New" w:eastAsia="Courier New" w:hAnsi="Courier New" w:cs="Courier New"/>
-          <w:szCs w:val="36"/>
-        </w:rPr>
-        <w:t># Direct database demonstration cd server npm run inspect</w:t>
-      </w:r>
-    </w:p>
-    <w:p>
-      <w:pPr>
         <w:spacing w:after="346"/>
         <w:ind w:left="-5"/>
       </w:pPr>
       <w:r>
         <w:t xml:space="preserve">The direct inspection command uses the official </w:t>
       </w:r>
+      <w:proofErr w:type="spellStart"/>
       <w:r>
         <w:rPr>
           <w:rFonts w:ascii="Courier New" w:eastAsia="Courier New" w:hAnsi="Courier New" w:cs="Courier New"/>
         </w:rPr>
         <w:t>mongodb</w:t>
       </w:r>
-      <w:r>
-        <w:t xml:space="preserve"> driver and displays the seven collections while hiding bcrypt hashes.</w:t>
+      <w:proofErr w:type="spellEnd"/>
+      <w:r>
+        <w:t xml:space="preserve"> driver and displays the seven collections while hiding </w:t>
+      </w:r>
+      <w:proofErr w:type="spellStart"/>
+      <w:r>
+        <w:t>bcrypt</w:t>
+      </w:r>
+      <w:proofErr w:type="spellEnd"/>
+      <w:r>
+        <w:t xml:space="preserve"> hashes.</w:t>
       </w:r>
     </w:p>
     <w:p>
@@ -7251,6 +9726,13 @@
         </w:rPr>
         <w:t>Normal user -&gt; Register/Login -&gt; User Home -&gt; Discover/Request Group</w:t>
       </w:r>
+      <w:r>
+        <w:rPr>
+          <w:rFonts w:ascii="Courier New" w:eastAsia="Courier New" w:hAnsi="Courier New" w:cs="Courier New"/>
+          <w:szCs w:val="36"/>
+        </w:rPr>
+        <w:t xml:space="preserve"> -&gt; Approval -&gt; My Groups</w:t>
+      </w:r>
     </w:p>
     <w:p>
       <w:pPr>
@@ -7266,7 +9748,21 @@
           <w:rFonts w:ascii="Courier New" w:eastAsia="Courier New" w:hAnsi="Courier New" w:cs="Courier New"/>
           <w:szCs w:val="36"/>
         </w:rPr>
-        <w:t xml:space="preserve">           -&gt; Approval -&gt; My Groups -&gt; Channel -&gt; Live Chat</w:t>
+        <w:t xml:space="preserve">           -&gt; Channel -&gt; Live Chat</w:t>
+      </w:r>
+      <w:r>
+        <w:rPr>
+          <w:rFonts w:ascii="Courier New" w:eastAsia="Courier New" w:hAnsi="Courier New" w:cs="Courier New"/>
+          <w:szCs w:val="36"/>
+        </w:rPr>
+        <w:t xml:space="preserve"> </w:t>
+      </w:r>
+      <w:r>
+        <w:rPr>
+          <w:rFonts w:ascii="Courier New" w:eastAsia="Courier New" w:hAnsi="Courier New" w:cs="Courier New"/>
+          <w:szCs w:val="36"/>
+        </w:rPr>
+        <w:t>-&gt; Profile -&gt; edit details/password/profile image</w:t>
       </w:r>
     </w:p>
     <w:p>
@@ -7283,12 +9779,12 @@
           <w:rFonts w:ascii="Courier New" w:eastAsia="Courier New" w:hAnsi="Courier New" w:cs="Courier New"/>
           <w:szCs w:val="36"/>
         </w:rPr>
-        <w:t xml:space="preserve">           -&gt; Profile -&gt; edit details/password/profile image</w:t>
+        <w:t>Group Admin -&gt; Group Admin -&gt; requests/members/channels/settings</w:t>
       </w:r>
     </w:p>
     <w:p>
       <w:pPr>
-        <w:spacing w:after="5" w:line="265" w:lineRule="auto"/>
+        <w:spacing w:after="311" w:line="265" w:lineRule="auto"/>
         <w:ind w:left="75"/>
         <w:rPr>
           <w:sz w:val="24"/>
@@ -7300,45 +9796,45 @@
           <w:rFonts w:ascii="Courier New" w:eastAsia="Courier New" w:hAnsi="Courier New" w:cs="Courier New"/>
           <w:szCs w:val="36"/>
         </w:rPr>
-        <w:t>Group Admin -&gt; Group Admin -&gt; requests/members/channels/settings</w:t>
+        <w:t>Super Admin -&gt; Dashboard -&gt; group requests / users / banned users / audit logs</w:t>
       </w:r>
     </w:p>
     <w:p>
       <w:pPr>
-        <w:spacing w:after="311" w:line="265" w:lineRule="auto"/>
-        <w:ind w:left="75"/>
-        <w:rPr>
-          <w:sz w:val="24"/>
-          <w:szCs w:val="36"/>
-        </w:rPr>
-      </w:pPr>
-      <w:r>
-        <w:rPr>
-          <w:rFonts w:ascii="Courier New" w:eastAsia="Courier New" w:hAnsi="Courier New" w:cs="Courier New"/>
-          <w:szCs w:val="36"/>
-        </w:rPr>
-        <w:t>Super Admin -&gt; Dashboard -&gt; group requests / users / banned users / audit logs</w:t>
+        <w:ind w:left="-5"/>
+      </w:pPr>
+      <w:r>
+        <w:t xml:space="preserve">The Phase 1 visual concept was retained but revised for role-aware navigation, responsive framing, contained chat scrolling, consistent </w:t>
+      </w:r>
+      <w:proofErr w:type="spellStart"/>
+      <w:r>
+        <w:t>Fabulari</w:t>
+      </w:r>
+      <w:proofErr w:type="spellEnd"/>
+      <w:r>
+        <w:t xml:space="preserve"> branding, distinct user/Super Admin themes and longer datasets. Lists and chat panels scroll inside their frames rather than pushing critical actions off-screen.</w:t>
+      </w:r>
+      <w:r>
+        <w:br w:type="page"/>
       </w:r>
     </w:p>
     <w:p>
       <w:pPr>
-        <w:ind w:left="-5"/>
-      </w:pPr>
-      <w:r>
-        <w:t>The Phase 1 visual concept was retained but revised for role-aware navigation, responsive framing, contained chat scrolling, consistent Fabulari branding, distinct user/Super Admin themes and longer datasets. Lists and chat panels scroll inside their frames rather than pushing critical actions off-screen.</w:t>
-      </w:r>
-      <w:r>
-        <w:br w:type="page"/>
+        <w:pStyle w:val="Heading1"/>
+        <w:ind w:left="435" w:hanging="450"/>
+      </w:pPr>
+      <w:r>
+        <w:lastRenderedPageBreak/>
+        <w:t>Creativity, complexity and design decisions</w:t>
       </w:r>
     </w:p>
     <w:p>
       <w:pPr>
-        <w:pStyle w:val="Heading1"/>
-        <w:ind w:left="435" w:hanging="450"/>
-      </w:pPr>
-      <w:r>
-        <w:lastRenderedPageBreak/>
-        <w:t>Creativity, complexity and design decisions</w:t>
+        <w:spacing w:after="218"/>
+        <w:ind w:left="-5"/>
+      </w:pPr>
+      <w:r>
+        <w:t>Complexity comes from combining group-scoped authorization, asynchronous approval queues, server-enforced business invariants, native MongoDB persistence, real-time Socket.io rooms, live text/image messaging, sender avatars, connection-aware presence, synchronized deletion, two levels of administration, auditability and responsive role-specific interfaces.</w:t>
       </w:r>
     </w:p>
     <w:p>
@@ -7347,7 +9843,7 @@
         <w:ind w:left="-5"/>
       </w:pPr>
       <w:r>
-        <w:t>Complexity comes from combining group-scoped authorization, asynchronous approval queues, server-enforced business invariants, native MongoDB persistence, real-time Socket.io rooms, live text/image messaging, sender avatars, connection-aware presence, synchronized deletion, two levels of administration, auditability and responsive role-specific interfaces.</w:t>
+        <w:t>Efficiency is addressed through MongoDB indexes, bounded persistent chat history, room-scoped Socket.io broadcasts and a connection-count map for presence. The five-message rule is enforced on persistent MongoDB history without unnecessarily discarding additional messages already received by an active Angular session.</w:t>
       </w:r>
     </w:p>
     <w:p>
@@ -7356,7 +9852,15 @@
         <w:ind w:left="-5"/>
       </w:pPr>
       <w:r>
-        <w:t>Efficiency is addressed through MongoDB indexes, bounded persistent chat history, room-scoped Socket.io broadcasts and a connection-count map for presence. The five-message rule is enforced on persistent MongoDB history without unnecessarily discarding additional messages already received by an active Angular session.</w:t>
+        <w:t xml:space="preserve">Security is addressed by server-side authorization and </w:t>
+      </w:r>
+      <w:proofErr w:type="spellStart"/>
+      <w:r>
+        <w:t>bcrypt</w:t>
+      </w:r>
+      <w:proofErr w:type="spellEnd"/>
+      <w:r>
+        <w:t xml:space="preserve"> rather than trusting Angular visibility. Socket message identity is tied to the verified user/channel stored on the socket after joining, and message deletion checks ownership.</w:t>
       </w:r>
     </w:p>
     <w:p>
@@ -7365,32 +9869,25 @@
         <w:ind w:left="-5"/>
       </w:pPr>
       <w:r>
-        <w:t>Security is addressed by server-side authorization and bcrypt rather than trusting Angular visibility. Socket message identity is tied to the verified user/channel stored on the socket after joining, and message deletion checks ownership.</w:t>
+        <w:t>UX is addressed through responsive themed pages, clear navigation, contained scrolling, immediate socket updates, profile pictures, online/offline status, image previews, inline channel renaming, consistent branding and human-readable validation/errors.</w:t>
       </w:r>
     </w:p>
     <w:p>
       <w:pPr>
-        <w:spacing w:after="218"/>
-        <w:ind w:left="-5"/>
-      </w:pPr>
-      <w:r>
-        <w:t>UX is addressed through responsive themed pages, clear navigation, contained scrolling, immediate socket updates, profile pictures, online/offline status, image previews, inline channel renaming, consistent branding and human-readable validation/errors.</w:t>
-      </w:r>
-    </w:p>
-    <w:p>
-      <w:pPr>
         <w:spacing w:after="345"/>
         <w:ind w:left="-5"/>
       </w:pPr>
       <w:r>
         <w:t xml:space="preserve">A custom native MongoDB data-access layer preserves a small document-style interface for the existing route code while using the assignment-permitted official </w:t>
       </w:r>
+      <w:proofErr w:type="spellStart"/>
       <w:r>
         <w:rPr>
           <w:rFonts w:ascii="Courier New" w:eastAsia="Courier New" w:hAnsi="Courier New" w:cs="Courier New"/>
         </w:rPr>
         <w:t>mongodb</w:t>
       </w:r>
+      <w:proofErr w:type="spellEnd"/>
       <w:r>
         <w:t xml:space="preserve"> driver underneath. This reduced unnecessary route rewrites during migration away from Mongoose while keeping MongoDB </w:t>
       </w:r>
@@ -7490,11 +9987,19 @@
       <w:r>
         <w:t xml:space="preserve">Before demonstration run </w:t>
       </w:r>
+      <w:proofErr w:type="spellStart"/>
       <w:r>
         <w:rPr>
           <w:rFonts w:ascii="Courier New" w:eastAsia="Courier New" w:hAnsi="Courier New" w:cs="Courier New"/>
         </w:rPr>
-        <w:t>npm install</w:t>
+        <w:t>npm</w:t>
+      </w:r>
+      <w:proofErr w:type="spellEnd"/>
+      <w:r>
+        <w:rPr>
+          <w:rFonts w:ascii="Courier New" w:eastAsia="Courier New" w:hAnsi="Courier New" w:cs="Courier New"/>
+        </w:rPr>
+        <w:t xml:space="preserve"> install</w:t>
       </w:r>
       <w:r>
         <w:t xml:space="preserve"> in root and </w:t>
@@ -7510,9 +10015,9 @@
       </w:r>
     </w:p>
     <w:sectPr>
-      <w:footerReference w:type="even" r:id="rId7"/>
-      <w:footerReference w:type="default" r:id="rId8"/>
-      <w:footerReference w:type="first" r:id="rId9"/>
+      <w:footerReference w:type="even" r:id="rId8"/>
+      <w:footerReference w:type="default" r:id="rId9"/>
+      <w:footerReference w:type="first" r:id="rId10"/>
       <w:pgSz w:w="11906" w:h="16838"/>
       <w:pgMar w:top="960" w:right="880" w:bottom="1040" w:left="880" w:header="720" w:footer="447" w:gutter="0"/>
       <w:cols w:space="720"/>
@@ -7556,12 +10061,21 @@
       <w:spacing w:after="0" w:line="259" w:lineRule="auto"/>
       <w:ind w:left="-40" w:right="-40" w:firstLine="0"/>
     </w:pPr>
+    <w:proofErr w:type="spellStart"/>
     <w:r>
       <w:rPr>
         <w:color w:val="808080"/>
         <w:sz w:val="16"/>
       </w:rPr>
-      <w:t>Fabuloso Phase 2 - Eden Moss - s5353249</w:t>
+      <w:t>Fabuloso</w:t>
+    </w:r>
+    <w:proofErr w:type="spellEnd"/>
+    <w:r>
+      <w:rPr>
+        <w:color w:val="808080"/>
+        <w:sz w:val="16"/>
+      </w:rPr>
+      <w:t xml:space="preserve"> Phase 2 - Eden Moss - s5353249</w:t>
     </w:r>
     <w:r>
       <w:rPr>
@@ -7608,12 +10122,21 @@
       <w:spacing w:after="0" w:line="259" w:lineRule="auto"/>
       <w:ind w:left="-40" w:right="-40" w:firstLine="0"/>
     </w:pPr>
+    <w:proofErr w:type="spellStart"/>
     <w:r>
       <w:rPr>
         <w:color w:val="808080"/>
         <w:sz w:val="16"/>
       </w:rPr>
-      <w:t>Fabuloso Phase 2 - Eden Moss - s5353249</w:t>
+      <w:t>Fabuloso</w:t>
+    </w:r>
+    <w:proofErr w:type="spellEnd"/>
+    <w:r>
+      <w:rPr>
+        <w:color w:val="808080"/>
+        <w:sz w:val="16"/>
+      </w:rPr>
+      <w:t xml:space="preserve"> Phase 2 - Eden Moss - s5353249</w:t>
     </w:r>
     <w:r>
       <w:rPr>
@@ -7660,12 +10183,21 @@
       <w:spacing w:after="0" w:line="259" w:lineRule="auto"/>
       <w:ind w:left="-40" w:right="-40" w:firstLine="0"/>
     </w:pPr>
+    <w:proofErr w:type="spellStart"/>
     <w:r>
       <w:rPr>
         <w:color w:val="808080"/>
         <w:sz w:val="16"/>
       </w:rPr>
-      <w:t>Fabuloso Phase 2 - Eden Moss - s5353249</w:t>
+      <w:t>Fabuloso</w:t>
+    </w:r>
+    <w:proofErr w:type="spellEnd"/>
+    <w:r>
+      <w:rPr>
+        <w:color w:val="808080"/>
+        <w:sz w:val="16"/>
+      </w:rPr>
+      <w:t xml:space="preserve"> Phase 2 - Eden Moss - s5353249</w:t>
     </w:r>
     <w:r>
       <w:rPr>
@@ -9918,7 +12450,6 @@
   <w:style w:type="character" w:default="1" w:styleId="DefaultParagraphFont">
     <w:name w:val="Default Paragraph Font"/>
     <w:uiPriority w:val="1"/>
-    <w:semiHidden/>
     <w:unhideWhenUsed/>
   </w:style>
   <w:style w:type="table" w:default="1" w:styleId="TableNormal">
@@ -9990,6 +12521,48 @@
       <w:color w:val="000000"/>
       <w:sz w:val="18"/>
     </w:rPr>
+  </w:style>
+  <w:style w:type="character" w:styleId="Hyperlink">
+    <w:name w:val="Hyperlink"/>
+    <w:basedOn w:val="DefaultParagraphFont"/>
+    <w:uiPriority w:val="99"/>
+    <w:unhideWhenUsed/>
+    <w:rsid w:val="00264EA9"/>
+    <w:rPr>
+      <w:color w:val="467886" w:themeColor="hyperlink"/>
+      <w:u w:val="single"/>
+    </w:rPr>
+  </w:style>
+  <w:style w:type="character" w:styleId="UnresolvedMention">
+    <w:name w:val="Unresolved Mention"/>
+    <w:basedOn w:val="DefaultParagraphFont"/>
+    <w:uiPriority w:val="99"/>
+    <w:semiHidden/>
+    <w:unhideWhenUsed/>
+    <w:rsid w:val="00264EA9"/>
+    <w:rPr>
+      <w:color w:val="605E5C"/>
+      <w:shd w:val="clear" w:color="auto" w:fill="E1DFDD"/>
+    </w:rPr>
+  </w:style>
+  <w:style w:type="table" w:styleId="TableGrid0">
+    <w:name w:val="Table Grid"/>
+    <w:basedOn w:val="TableNormal"/>
+    <w:uiPriority w:val="39"/>
+    <w:rsid w:val="00A71C0B"/>
+    <w:pPr>
+      <w:spacing w:after="0" w:line="240" w:lineRule="auto"/>
+    </w:pPr>
+    <w:tblPr>
+      <w:tblBorders>
+        <w:top w:val="single" w:sz="4" w:space="0" w:color="auto"/>
+        <w:left w:val="single" w:sz="4" w:space="0" w:color="auto"/>
+        <w:bottom w:val="single" w:sz="4" w:space="0" w:color="auto"/>
+        <w:right w:val="single" w:sz="4" w:space="0" w:color="auto"/>
+        <w:insideH w:val="single" w:sz="4" w:space="0" w:color="auto"/>
+        <w:insideV w:val="single" w:sz="4" w:space="0" w:color="auto"/>
+      </w:tblBorders>
+    </w:tblPr>
   </w:style>
 </w:styles>
 </file>

</xml_diff>

<commit_message>
Update 3: E2E, cleanup, fixing errors, etc.
</commit_message>
<xml_diff>
--- a/Phase2_Submission.docx
+++ b/Phase2_Submission.docx
@@ -1267,21 +1267,27 @@
         <w:ind w:left="-5"/>
       </w:pPr>
       <w:r>
-        <w:t xml:space="preserve">Development should be committed in </w:t>
-      </w:r>
-      <w:proofErr w:type="gramStart"/>
-      <w:r>
-        <w:t>small logical</w:t>
-      </w:r>
-      <w:proofErr w:type="gramEnd"/>
-      <w:r>
-        <w:t xml:space="preserve"> units rather than one final dump. Appropriate commit subjects include </w:t>
-      </w:r>
-      <w:r>
-        <w:rPr>
-          <w:rFonts w:ascii="Courier New" w:eastAsia="Courier New" w:hAnsi="Courier New" w:cs="Courier New"/>
-        </w:rPr>
-        <w:t>feat: add</w:t>
+        <w:t xml:space="preserve">Phase 2 is maintained in its own </w:t>
+      </w:r>
+      <w:proofErr w:type="spellStart"/>
+      <w:r>
+        <w:t>Fabulari</w:t>
+      </w:r>
+      <w:proofErr w:type="spellEnd"/>
+      <w:r>
+        <w:t xml:space="preserve"> repository. Final testing, cleanup and documentation improvements are committed separately so the submitted history reflects the final development work. Generated dependencies (</w:t>
+      </w:r>
+      <w:proofErr w:type="spellStart"/>
+      <w:r>
+        <w:t>node_modules</w:t>
+      </w:r>
+      <w:proofErr w:type="spellEnd"/>
+      <w:r>
+        <w:t xml:space="preserve">) are </w:t>
+      </w:r>
+      <w:r>
+        <w:lastRenderedPageBreak/>
+        <w:t>excluded. The repository root separates Angular, server, tests, assets and documentation so a marker can locate each concern quickly. The tutor must be added as a collaborator if the repository is private.</w:t>
       </w:r>
     </w:p>
     <w:p>
@@ -1293,7 +1299,6 @@
         <w:rPr>
           <w:rFonts w:ascii="Courier New" w:eastAsia="Courier New" w:hAnsi="Courier New" w:cs="Courier New"/>
         </w:rPr>
-        <w:lastRenderedPageBreak/>
         <w:t>group membership approval</w:t>
       </w:r>
       <w:r>
@@ -1963,54 +1968,21 @@
             </w:tcBorders>
           </w:tcPr>
           <w:p>
-            <w:pPr>
-              <w:spacing w:after="0" w:line="259" w:lineRule="auto"/>
-              <w:ind w:left="0" w:firstLine="0"/>
-              <w:rPr>
-                <w:szCs w:val="36"/>
-              </w:rPr>
-            </w:pPr>
             <w:proofErr w:type="spellStart"/>
             <w:r>
-              <w:rPr>
-                <w:szCs w:val="36"/>
-              </w:rPr>
               <w:t>channelId</w:t>
             </w:r>
             <w:proofErr w:type="spellEnd"/>
             <w:r>
-              <w:rPr>
-                <w:szCs w:val="36"/>
-              </w:rPr>
               <w:t xml:space="preserve">, </w:t>
             </w:r>
             <w:proofErr w:type="spellStart"/>
             <w:r>
-              <w:rPr>
-                <w:szCs w:val="36"/>
-              </w:rPr>
               <w:t>userId</w:t>
             </w:r>
             <w:proofErr w:type="spellEnd"/>
             <w:r>
-              <w:rPr>
-                <w:szCs w:val="36"/>
-              </w:rPr>
-              <w:t xml:space="preserve">, username, </w:t>
-            </w:r>
-            <w:proofErr w:type="spellStart"/>
-            <w:r>
-              <w:rPr>
-                <w:szCs w:val="36"/>
-              </w:rPr>
-              <w:t>profilePicture</w:t>
-            </w:r>
-            <w:proofErr w:type="spellEnd"/>
-            <w:r>
-              <w:rPr>
-                <w:szCs w:val="36"/>
-              </w:rPr>
-              <w:t>, text, image, deleted, timestamp</w:t>
+              <w:t>, username, text, image, deleted, timestamp</w:t>
             </w:r>
           </w:p>
         </w:tc>
@@ -9260,13 +9232,7 @@
         <w:ind w:left="-5"/>
       </w:pPr>
       <w:r>
-        <w:t xml:space="preserve">Recommended </w:t>
-      </w:r>
-      <w:r>
-        <w:t>R</w:t>
-      </w:r>
-      <w:r>
-        <w:t>un</w:t>
+        <w:t>Recommended Run</w:t>
       </w:r>
     </w:p>
     <w:p>
@@ -9973,7 +9939,15 @@
         <w:spacing w:line="271" w:lineRule="auto"/>
       </w:pPr>
       <w:r>
-        <w:t>Preserve meaningful Git history; do not replace the repository with a single final commit.</w:t>
+        <w:t xml:space="preserve">Keep the submitted </w:t>
+      </w:r>
+      <w:proofErr w:type="spellStart"/>
+      <w:r>
+        <w:t>Fabulari</w:t>
+      </w:r>
+      <w:proofErr w:type="spellEnd"/>
+      <w:r>
+        <w:t xml:space="preserve"> repository up to date with the final testing, cleanup and documentation commits.</w:t>
       </w:r>
     </w:p>
     <w:p>
@@ -12450,6 +12424,7 @@
   <w:style w:type="character" w:default="1" w:styleId="DefaultParagraphFont">
     <w:name w:val="Default Paragraph Font"/>
     <w:uiPriority w:val="1"/>
+    <w:semiHidden/>
     <w:unhideWhenUsed/>
   </w:style>
   <w:style w:type="table" w:default="1" w:styleId="TableNormal">

</xml_diff>